<commit_message>
Add more informations about the 1-25 sections
</commit_message>
<xml_diff>
--- a/React_Frontend_2026.docx
+++ b/React_Frontend_2026.docx
@@ -798,7 +798,7 @@
     </w:p>
     <w:tbl>
       <w:tblPr>
-        <w:tblW w:type="dxa" w:w="9360"/>
+        <w:tblW w:type="dxa" w:w="9720"/>
         <w:tblBorders>
           <w:top w:val="single" w:color="auto" w:sz="4"/>
           <w:left w:val="single" w:color="auto" w:sz="4"/>
@@ -809,13 +809,14 @@
         </w:tblBorders>
       </w:tblPr>
       <w:tblGrid>
-        <w:gridCol w:w="4680"/>
-        <w:gridCol w:w="4680"/>
+        <w:gridCol w:w="3240"/>
+        <w:gridCol w:w="3240"/>
+        <w:gridCol w:w="3240"/>
       </w:tblGrid>
       <w:tr>
         <w:tc>
           <w:tcPr>
-            <w:tcW w:type="dxa" w:w="4680"/>
+            <w:tcW w:type="dxa" w:w="3240"/>
             <w:tcBorders>
               <w:top w:val="single" w:color="BDBDBD" w:sz="1"/>
               <w:left w:val="single" w:color="BDBDBD" w:sz="1"/>
@@ -824,21 +825,25 @@
             </w:tcBorders>
             <w:shd w:fill="BBDEFB" w:val="clear"/>
             <w:tcMar>
-              <w:top w:type="dxa" w:w="80"/>
+              <w:top w:type="dxa" w:w="120"/>
               <w:left w:type="dxa" w:w="120"/>
-              <w:bottom w:type="dxa" w:w="80"/>
+              <w:bottom w:type="dxa" w:w="120"/>
               <w:right w:type="dxa" w:w="120"/>
             </w:tcMar>
+            <w:vAlign w:val="center"/>
           </w:tcPr>
           <w:p>
+            <w:pPr>
+              <w:jc w:val="left"/>
+            </w:pPr>
             <w:r>
               <w:rPr>
                 <w:rFonts w:ascii="Arial" w:cs="Arial" w:eastAsia="Arial" w:hAnsi="Arial"/>
                 <w:b/>
                 <w:bCs/>
                 <w:color w:val="0D47A1"/>
-                <w:sz w:val="22"/>
-                <w:szCs w:val="22"/>
+                <w:sz w:val="20"/>
+                <w:szCs w:val="20"/>
               </w:rPr>
               <w:t xml:space="preserve">Criteria</w:t>
             </w:r>
@@ -846,7 +851,7 @@
         </w:tc>
         <w:tc>
           <w:tcPr>
-            <w:tcW w:type="dxa" w:w="4680"/>
+            <w:tcW w:type="dxa" w:w="3240"/>
             <w:tcBorders>
               <w:top w:val="single" w:color="BDBDBD" w:sz="1"/>
               <w:left w:val="single" w:color="BDBDBD" w:sz="1"/>
@@ -855,21 +860,25 @@
             </w:tcBorders>
             <w:shd w:fill="BBDEFB" w:val="clear"/>
             <w:tcMar>
-              <w:top w:type="dxa" w:w="80"/>
+              <w:top w:type="dxa" w:w="120"/>
               <w:left w:type="dxa" w:w="120"/>
-              <w:bottom w:type="dxa" w:w="80"/>
+              <w:bottom w:type="dxa" w:w="120"/>
               <w:right w:type="dxa" w:w="120"/>
             </w:tcMar>
+            <w:vAlign w:val="center"/>
           </w:tcPr>
           <w:p>
+            <w:pPr>
+              <w:jc w:val="left"/>
+            </w:pPr>
             <w:r>
               <w:rPr>
                 <w:rFonts w:ascii="Arial" w:cs="Arial" w:eastAsia="Arial" w:hAnsi="Arial"/>
                 <w:b/>
                 <w:bCs/>
                 <w:color w:val="0D47A1"/>
-                <w:sz w:val="22"/>
-                <w:szCs w:val="22"/>
+                <w:sz w:val="20"/>
+                <w:szCs w:val="20"/>
               </w:rPr>
               <w:t xml:space="preserve">REST</w:t>
             </w:r>
@@ -877,7 +886,7 @@
         </w:tc>
         <w:tc>
           <w:tcPr>
-            <w:tcW w:type="dxa" w:w="4680"/>
+            <w:tcW w:type="dxa" w:w="3240"/>
             <w:tcBorders>
               <w:top w:val="single" w:color="BDBDBD" w:sz="1"/>
               <w:left w:val="single" w:color="BDBDBD" w:sz="1"/>
@@ -886,21 +895,25 @@
             </w:tcBorders>
             <w:shd w:fill="BBDEFB" w:val="clear"/>
             <w:tcMar>
-              <w:top w:type="dxa" w:w="80"/>
+              <w:top w:type="dxa" w:w="120"/>
               <w:left w:type="dxa" w:w="120"/>
-              <w:bottom w:type="dxa" w:w="80"/>
+              <w:bottom w:type="dxa" w:w="120"/>
               <w:right w:type="dxa" w:w="120"/>
             </w:tcMar>
+            <w:vAlign w:val="center"/>
           </w:tcPr>
           <w:p>
+            <w:pPr>
+              <w:jc w:val="left"/>
+            </w:pPr>
             <w:r>
               <w:rPr>
                 <w:rFonts w:ascii="Arial" w:cs="Arial" w:eastAsia="Arial" w:hAnsi="Arial"/>
                 <w:b/>
                 <w:bCs/>
                 <w:color w:val="0D47A1"/>
-                <w:sz w:val="22"/>
-                <w:szCs w:val="22"/>
+                <w:sz w:val="20"/>
+                <w:szCs w:val="20"/>
               </w:rPr>
               <w:t xml:space="preserve">GraphQL</w:t>
             </w:r>
@@ -910,7 +923,7 @@
       <w:tr>
         <w:tc>
           <w:tcPr>
-            <w:tcW w:type="dxa" w:w="4680"/>
+            <w:tcW w:type="dxa" w:w="3240"/>
             <w:tcBorders>
               <w:top w:val="single" w:color="BDBDBD" w:sz="1"/>
               <w:left w:val="single" w:color="BDBDBD" w:sz="1"/>
@@ -919,21 +932,25 @@
             </w:tcBorders>
             <w:shd w:fill="FFFFFF" w:val="clear"/>
             <w:tcMar>
-              <w:top w:type="dxa" w:w="80"/>
+              <w:top w:type="dxa" w:w="120"/>
               <w:left w:type="dxa" w:w="120"/>
-              <w:bottom w:type="dxa" w:w="80"/>
+              <w:bottom w:type="dxa" w:w="120"/>
               <w:right w:type="dxa" w:w="120"/>
             </w:tcMar>
+            <w:vAlign w:val="center"/>
           </w:tcPr>
           <w:p>
+            <w:pPr>
+              <w:jc w:val="left"/>
+            </w:pPr>
             <w:r>
               <w:rPr>
                 <w:rFonts w:ascii="Arial" w:cs="Arial" w:eastAsia="Arial" w:hAnsi="Arial"/>
                 <w:b w:val="false"/>
                 <w:bCs w:val="false"/>
                 <w:color w:val="212121"/>
-                <w:sz w:val="20"/>
-                <w:szCs w:val="20"/>
+                <w:sz w:val="18"/>
+                <w:szCs w:val="18"/>
               </w:rPr>
               <w:t xml:space="preserve">Fetching</w:t>
             </w:r>
@@ -941,7 +958,7 @@
         </w:tc>
         <w:tc>
           <w:tcPr>
-            <w:tcW w:type="dxa" w:w="4680"/>
+            <w:tcW w:type="dxa" w:w="3240"/>
             <w:tcBorders>
               <w:top w:val="single" w:color="BDBDBD" w:sz="1"/>
               <w:left w:val="single" w:color="BDBDBD" w:sz="1"/>
@@ -950,21 +967,25 @@
             </w:tcBorders>
             <w:shd w:fill="FFFFFF" w:val="clear"/>
             <w:tcMar>
-              <w:top w:type="dxa" w:w="80"/>
+              <w:top w:type="dxa" w:w="120"/>
               <w:left w:type="dxa" w:w="120"/>
-              <w:bottom w:type="dxa" w:w="80"/>
+              <w:bottom w:type="dxa" w:w="120"/>
               <w:right w:type="dxa" w:w="120"/>
             </w:tcMar>
+            <w:vAlign w:val="center"/>
           </w:tcPr>
           <w:p>
+            <w:pPr>
+              <w:jc w:val="left"/>
+            </w:pPr>
             <w:r>
               <w:rPr>
                 <w:rFonts w:ascii="Arial" w:cs="Arial" w:eastAsia="Arial" w:hAnsi="Arial"/>
                 <w:b w:val="false"/>
                 <w:bCs w:val="false"/>
                 <w:color w:val="212121"/>
-                <w:sz w:val="20"/>
-                <w:szCs w:val="20"/>
+                <w:sz w:val="18"/>
+                <w:szCs w:val="18"/>
               </w:rPr>
               <w:t xml:space="preserve">Multiple endpoints (GET /users, /posts)</w:t>
             </w:r>
@@ -972,7 +993,7 @@
         </w:tc>
         <w:tc>
           <w:tcPr>
-            <w:tcW w:type="dxa" w:w="4680"/>
+            <w:tcW w:type="dxa" w:w="3240"/>
             <w:tcBorders>
               <w:top w:val="single" w:color="BDBDBD" w:sz="1"/>
               <w:left w:val="single" w:color="BDBDBD" w:sz="1"/>
@@ -981,21 +1002,25 @@
             </w:tcBorders>
             <w:shd w:fill="FFFFFF" w:val="clear"/>
             <w:tcMar>
-              <w:top w:type="dxa" w:w="80"/>
+              <w:top w:type="dxa" w:w="120"/>
               <w:left w:type="dxa" w:w="120"/>
-              <w:bottom w:type="dxa" w:w="80"/>
+              <w:bottom w:type="dxa" w:w="120"/>
               <w:right w:type="dxa" w:w="120"/>
             </w:tcMar>
+            <w:vAlign w:val="center"/>
           </w:tcPr>
           <w:p>
+            <w:pPr>
+              <w:jc w:val="left"/>
+            </w:pPr>
             <w:r>
               <w:rPr>
                 <w:rFonts w:ascii="Arial" w:cs="Arial" w:eastAsia="Arial" w:hAnsi="Arial"/>
                 <w:b w:val="false"/>
                 <w:bCs w:val="false"/>
                 <w:color w:val="212121"/>
-                <w:sz w:val="20"/>
-                <w:szCs w:val="20"/>
+                <w:sz w:val="18"/>
+                <w:szCs w:val="18"/>
               </w:rPr>
               <w:t xml:space="preserve">Single endpoint (/graphql)</w:t>
             </w:r>
@@ -1005,7 +1030,7 @@
       <w:tr>
         <w:tc>
           <w:tcPr>
-            <w:tcW w:type="dxa" w:w="4680"/>
+            <w:tcW w:type="dxa" w:w="3240"/>
             <w:tcBorders>
               <w:top w:val="single" w:color="BDBDBD" w:sz="1"/>
               <w:left w:val="single" w:color="BDBDBD" w:sz="1"/>
@@ -1014,21 +1039,25 @@
             </w:tcBorders>
             <w:shd w:fill="E3F2FD" w:val="clear"/>
             <w:tcMar>
-              <w:top w:type="dxa" w:w="80"/>
+              <w:top w:type="dxa" w:w="120"/>
               <w:left w:type="dxa" w:w="120"/>
-              <w:bottom w:type="dxa" w:w="80"/>
+              <w:bottom w:type="dxa" w:w="120"/>
               <w:right w:type="dxa" w:w="120"/>
             </w:tcMar>
+            <w:vAlign w:val="center"/>
           </w:tcPr>
           <w:p>
+            <w:pPr>
+              <w:jc w:val="left"/>
+            </w:pPr>
             <w:r>
               <w:rPr>
                 <w:rFonts w:ascii="Arial" w:cs="Arial" w:eastAsia="Arial" w:hAnsi="Arial"/>
                 <w:b w:val="false"/>
                 <w:bCs w:val="false"/>
                 <w:color w:val="212121"/>
-                <w:sz w:val="20"/>
-                <w:szCs w:val="20"/>
+                <w:sz w:val="18"/>
+                <w:szCs w:val="18"/>
               </w:rPr>
               <w:t xml:space="preserve">Over-fetching</w:t>
             </w:r>
@@ -1036,7 +1065,7 @@
         </w:tc>
         <w:tc>
           <w:tcPr>
-            <w:tcW w:type="dxa" w:w="4680"/>
+            <w:tcW w:type="dxa" w:w="3240"/>
             <w:tcBorders>
               <w:top w:val="single" w:color="BDBDBD" w:sz="1"/>
               <w:left w:val="single" w:color="BDBDBD" w:sz="1"/>
@@ -1045,21 +1074,25 @@
             </w:tcBorders>
             <w:shd w:fill="E3F2FD" w:val="clear"/>
             <w:tcMar>
-              <w:top w:type="dxa" w:w="80"/>
+              <w:top w:type="dxa" w:w="120"/>
               <w:left w:type="dxa" w:w="120"/>
-              <w:bottom w:type="dxa" w:w="80"/>
+              <w:bottom w:type="dxa" w:w="120"/>
               <w:right w:type="dxa" w:w="120"/>
             </w:tcMar>
+            <w:vAlign w:val="center"/>
           </w:tcPr>
           <w:p>
+            <w:pPr>
+              <w:jc w:val="left"/>
+            </w:pPr>
             <w:r>
               <w:rPr>
                 <w:rFonts w:ascii="Arial" w:cs="Arial" w:eastAsia="Arial" w:hAnsi="Arial"/>
                 <w:b w:val="false"/>
                 <w:bCs w:val="false"/>
                 <w:color w:val="212121"/>
-                <w:sz w:val="20"/>
-                <w:szCs w:val="20"/>
+                <w:sz w:val="18"/>
+                <w:szCs w:val="18"/>
               </w:rPr>
               <w:t xml:space="preserve">Common: returns entire user object</w:t>
             </w:r>
@@ -1067,7 +1100,7 @@
         </w:tc>
         <w:tc>
           <w:tcPr>
-            <w:tcW w:type="dxa" w:w="4680"/>
+            <w:tcW w:type="dxa" w:w="3240"/>
             <w:tcBorders>
               <w:top w:val="single" w:color="BDBDBD" w:sz="1"/>
               <w:left w:val="single" w:color="BDBDBD" w:sz="1"/>
@@ -1076,21 +1109,25 @@
             </w:tcBorders>
             <w:shd w:fill="E3F2FD" w:val="clear"/>
             <w:tcMar>
-              <w:top w:type="dxa" w:w="80"/>
+              <w:top w:type="dxa" w:w="120"/>
               <w:left w:type="dxa" w:w="120"/>
-              <w:bottom w:type="dxa" w:w="80"/>
+              <w:bottom w:type="dxa" w:w="120"/>
               <w:right w:type="dxa" w:w="120"/>
             </w:tcMar>
+            <w:vAlign w:val="center"/>
           </w:tcPr>
           <w:p>
+            <w:pPr>
+              <w:jc w:val="left"/>
+            </w:pPr>
             <w:r>
               <w:rPr>
                 <w:rFonts w:ascii="Arial" w:cs="Arial" w:eastAsia="Arial" w:hAnsi="Arial"/>
                 <w:b w:val="false"/>
                 <w:bCs w:val="false"/>
                 <w:color w:val="212121"/>
-                <w:sz w:val="20"/>
-                <w:szCs w:val="20"/>
+                <w:sz w:val="18"/>
+                <w:szCs w:val="18"/>
               </w:rPr>
               <w:t xml:space="preserve">None: client selects specific fields</w:t>
             </w:r>
@@ -1100,7 +1137,7 @@
       <w:tr>
         <w:tc>
           <w:tcPr>
-            <w:tcW w:type="dxa" w:w="4680"/>
+            <w:tcW w:type="dxa" w:w="3240"/>
             <w:tcBorders>
               <w:top w:val="single" w:color="BDBDBD" w:sz="1"/>
               <w:left w:val="single" w:color="BDBDBD" w:sz="1"/>
@@ -1109,21 +1146,25 @@
             </w:tcBorders>
             <w:shd w:fill="FFFFFF" w:val="clear"/>
             <w:tcMar>
-              <w:top w:type="dxa" w:w="80"/>
+              <w:top w:type="dxa" w:w="120"/>
               <w:left w:type="dxa" w:w="120"/>
-              <w:bottom w:type="dxa" w:w="80"/>
+              <w:bottom w:type="dxa" w:w="120"/>
               <w:right w:type="dxa" w:w="120"/>
             </w:tcMar>
+            <w:vAlign w:val="center"/>
           </w:tcPr>
           <w:p>
+            <w:pPr>
+              <w:jc w:val="left"/>
+            </w:pPr>
             <w:r>
               <w:rPr>
                 <w:rFonts w:ascii="Arial" w:cs="Arial" w:eastAsia="Arial" w:hAnsi="Arial"/>
                 <w:b w:val="false"/>
                 <w:bCs w:val="false"/>
                 <w:color w:val="212121"/>
-                <w:sz w:val="20"/>
-                <w:szCs w:val="20"/>
+                <w:sz w:val="18"/>
+                <w:szCs w:val="18"/>
               </w:rPr>
               <w:t xml:space="preserve">Under-fetching</w:t>
             </w:r>
@@ -1131,7 +1172,7 @@
         </w:tc>
         <w:tc>
           <w:tcPr>
-            <w:tcW w:type="dxa" w:w="4680"/>
+            <w:tcW w:type="dxa" w:w="3240"/>
             <w:tcBorders>
               <w:top w:val="single" w:color="BDBDBD" w:sz="1"/>
               <w:left w:val="single" w:color="BDBDBD" w:sz="1"/>
@@ -1140,21 +1181,25 @@
             </w:tcBorders>
             <w:shd w:fill="FFFFFF" w:val="clear"/>
             <w:tcMar>
-              <w:top w:type="dxa" w:w="80"/>
+              <w:top w:type="dxa" w:w="120"/>
               <w:left w:type="dxa" w:w="120"/>
-              <w:bottom w:type="dxa" w:w="80"/>
+              <w:bottom w:type="dxa" w:w="120"/>
               <w:right w:type="dxa" w:w="120"/>
             </w:tcMar>
+            <w:vAlign w:val="center"/>
           </w:tcPr>
           <w:p>
+            <w:pPr>
+              <w:jc w:val="left"/>
+            </w:pPr>
             <w:r>
               <w:rPr>
                 <w:rFonts w:ascii="Arial" w:cs="Arial" w:eastAsia="Arial" w:hAnsi="Arial"/>
                 <w:b w:val="false"/>
                 <w:bCs w:val="false"/>
                 <w:color w:val="212121"/>
-                <w:sz w:val="20"/>
-                <w:szCs w:val="20"/>
+                <w:sz w:val="18"/>
+                <w:szCs w:val="18"/>
               </w:rPr>
               <w:t xml:space="preserve">Common: requires multiple round-trips</w:t>
             </w:r>
@@ -1162,7 +1207,7 @@
         </w:tc>
         <w:tc>
           <w:tcPr>
-            <w:tcW w:type="dxa" w:w="4680"/>
+            <w:tcW w:type="dxa" w:w="3240"/>
             <w:tcBorders>
               <w:top w:val="single" w:color="BDBDBD" w:sz="1"/>
               <w:left w:val="single" w:color="BDBDBD" w:sz="1"/>
@@ -1171,21 +1216,25 @@
             </w:tcBorders>
             <w:shd w:fill="FFFFFF" w:val="clear"/>
             <w:tcMar>
-              <w:top w:type="dxa" w:w="80"/>
+              <w:top w:type="dxa" w:w="120"/>
               <w:left w:type="dxa" w:w="120"/>
-              <w:bottom w:type="dxa" w:w="80"/>
+              <w:bottom w:type="dxa" w:w="120"/>
               <w:right w:type="dxa" w:w="120"/>
             </w:tcMar>
+            <w:vAlign w:val="center"/>
           </w:tcPr>
           <w:p>
+            <w:pPr>
+              <w:jc w:val="left"/>
+            </w:pPr>
             <w:r>
               <w:rPr>
                 <w:rFonts w:ascii="Arial" w:cs="Arial" w:eastAsia="Arial" w:hAnsi="Arial"/>
                 <w:b w:val="false"/>
                 <w:bCs w:val="false"/>
                 <w:color w:val="212121"/>
-                <w:sz w:val="20"/>
-                <w:szCs w:val="20"/>
+                <w:sz w:val="18"/>
+                <w:szCs w:val="18"/>
               </w:rPr>
               <w:t xml:space="preserve">None: nested queries fetch all at once</w:t>
             </w:r>
@@ -1195,7 +1244,7 @@
       <w:tr>
         <w:tc>
           <w:tcPr>
-            <w:tcW w:type="dxa" w:w="4680"/>
+            <w:tcW w:type="dxa" w:w="3240"/>
             <w:tcBorders>
               <w:top w:val="single" w:color="BDBDBD" w:sz="1"/>
               <w:left w:val="single" w:color="BDBDBD" w:sz="1"/>
@@ -1204,21 +1253,25 @@
             </w:tcBorders>
             <w:shd w:fill="E3F2FD" w:val="clear"/>
             <w:tcMar>
-              <w:top w:type="dxa" w:w="80"/>
+              <w:top w:type="dxa" w:w="120"/>
               <w:left w:type="dxa" w:w="120"/>
-              <w:bottom w:type="dxa" w:w="80"/>
+              <w:bottom w:type="dxa" w:w="120"/>
               <w:right w:type="dxa" w:w="120"/>
             </w:tcMar>
+            <w:vAlign w:val="center"/>
           </w:tcPr>
           <w:p>
+            <w:pPr>
+              <w:jc w:val="left"/>
+            </w:pPr>
             <w:r>
               <w:rPr>
                 <w:rFonts w:ascii="Arial" w:cs="Arial" w:eastAsia="Arial" w:hAnsi="Arial"/>
                 <w:b w:val="false"/>
                 <w:bCs w:val="false"/>
                 <w:color w:val="212121"/>
-                <w:sz w:val="20"/>
-                <w:szCs w:val="20"/>
+                <w:sz w:val="18"/>
+                <w:szCs w:val="18"/>
               </w:rPr>
               <w:t xml:space="preserve">Versioning</w:t>
             </w:r>
@@ -1226,7 +1279,7 @@
         </w:tc>
         <w:tc>
           <w:tcPr>
-            <w:tcW w:type="dxa" w:w="4680"/>
+            <w:tcW w:type="dxa" w:w="3240"/>
             <w:tcBorders>
               <w:top w:val="single" w:color="BDBDBD" w:sz="1"/>
               <w:left w:val="single" w:color="BDBDBD" w:sz="1"/>
@@ -1235,21 +1288,25 @@
             </w:tcBorders>
             <w:shd w:fill="E3F2FD" w:val="clear"/>
             <w:tcMar>
-              <w:top w:type="dxa" w:w="80"/>
+              <w:top w:type="dxa" w:w="120"/>
               <w:left w:type="dxa" w:w="120"/>
-              <w:bottom w:type="dxa" w:w="80"/>
+              <w:bottom w:type="dxa" w:w="120"/>
               <w:right w:type="dxa" w:w="120"/>
             </w:tcMar>
+            <w:vAlign w:val="center"/>
           </w:tcPr>
           <w:p>
+            <w:pPr>
+              <w:jc w:val="left"/>
+            </w:pPr>
             <w:r>
               <w:rPr>
                 <w:rFonts w:ascii="Arial" w:cs="Arial" w:eastAsia="Arial" w:hAnsi="Arial"/>
                 <w:b w:val="false"/>
                 <w:bCs w:val="false"/>
                 <w:color w:val="212121"/>
-                <w:sz w:val="20"/>
-                <w:szCs w:val="20"/>
+                <w:sz w:val="18"/>
+                <w:szCs w:val="18"/>
               </w:rPr>
               <w:t xml:space="preserve">URL-based (/v1, /v2)</w:t>
             </w:r>
@@ -1257,7 +1314,7 @@
         </w:tc>
         <w:tc>
           <w:tcPr>
-            <w:tcW w:type="dxa" w:w="4680"/>
+            <w:tcW w:type="dxa" w:w="3240"/>
             <w:tcBorders>
               <w:top w:val="single" w:color="BDBDBD" w:sz="1"/>
               <w:left w:val="single" w:color="BDBDBD" w:sz="1"/>
@@ -1266,21 +1323,25 @@
             </w:tcBorders>
             <w:shd w:fill="E3F2FD" w:val="clear"/>
             <w:tcMar>
-              <w:top w:type="dxa" w:w="80"/>
+              <w:top w:type="dxa" w:w="120"/>
               <w:left w:type="dxa" w:w="120"/>
-              <w:bottom w:type="dxa" w:w="80"/>
+              <w:bottom w:type="dxa" w:w="120"/>
               <w:right w:type="dxa" w:w="120"/>
             </w:tcMar>
+            <w:vAlign w:val="center"/>
           </w:tcPr>
           <w:p>
+            <w:pPr>
+              <w:jc w:val="left"/>
+            </w:pPr>
             <w:r>
               <w:rPr>
                 <w:rFonts w:ascii="Arial" w:cs="Arial" w:eastAsia="Arial" w:hAnsi="Arial"/>
                 <w:b w:val="false"/>
                 <w:bCs w:val="false"/>
                 <w:color w:val="212121"/>
-                <w:sz w:val="20"/>
-                <w:szCs w:val="20"/>
+                <w:sz w:val="18"/>
+                <w:szCs w:val="18"/>
               </w:rPr>
               <w:t xml:space="preserve">Evolutionary (deprecate fields)</w:t>
             </w:r>
@@ -1290,7 +1351,7 @@
       <w:tr>
         <w:tc>
           <w:tcPr>
-            <w:tcW w:type="dxa" w:w="4680"/>
+            <w:tcW w:type="dxa" w:w="3240"/>
             <w:tcBorders>
               <w:top w:val="single" w:color="BDBDBD" w:sz="1"/>
               <w:left w:val="single" w:color="BDBDBD" w:sz="1"/>
@@ -1299,21 +1360,25 @@
             </w:tcBorders>
             <w:shd w:fill="FFFFFF" w:val="clear"/>
             <w:tcMar>
-              <w:top w:type="dxa" w:w="80"/>
+              <w:top w:type="dxa" w:w="120"/>
               <w:left w:type="dxa" w:w="120"/>
-              <w:bottom w:type="dxa" w:w="80"/>
+              <w:bottom w:type="dxa" w:w="120"/>
               <w:right w:type="dxa" w:w="120"/>
             </w:tcMar>
+            <w:vAlign w:val="center"/>
           </w:tcPr>
           <w:p>
+            <w:pPr>
+              <w:jc w:val="left"/>
+            </w:pPr>
             <w:r>
               <w:rPr>
                 <w:rFonts w:ascii="Arial" w:cs="Arial" w:eastAsia="Arial" w:hAnsi="Arial"/>
                 <w:b w:val="false"/>
                 <w:bCs w:val="false"/>
                 <w:color w:val="212121"/>
-                <w:sz w:val="20"/>
-                <w:szCs w:val="20"/>
+                <w:sz w:val="18"/>
+                <w:szCs w:val="18"/>
               </w:rPr>
               <w:t xml:space="preserve">Caching</w:t>
             </w:r>
@@ -1321,7 +1386,7 @@
         </w:tc>
         <w:tc>
           <w:tcPr>
-            <w:tcW w:type="dxa" w:w="4680"/>
+            <w:tcW w:type="dxa" w:w="3240"/>
             <w:tcBorders>
               <w:top w:val="single" w:color="BDBDBD" w:sz="1"/>
               <w:left w:val="single" w:color="BDBDBD" w:sz="1"/>
@@ -1330,21 +1395,25 @@
             </w:tcBorders>
             <w:shd w:fill="FFFFFF" w:val="clear"/>
             <w:tcMar>
-              <w:top w:type="dxa" w:w="80"/>
+              <w:top w:type="dxa" w:w="120"/>
               <w:left w:type="dxa" w:w="120"/>
-              <w:bottom w:type="dxa" w:w="80"/>
+              <w:bottom w:type="dxa" w:w="120"/>
               <w:right w:type="dxa" w:w="120"/>
             </w:tcMar>
+            <w:vAlign w:val="center"/>
           </w:tcPr>
           <w:p>
+            <w:pPr>
+              <w:jc w:val="left"/>
+            </w:pPr>
             <w:r>
               <w:rPr>
                 <w:rFonts w:ascii="Arial" w:cs="Arial" w:eastAsia="Arial" w:hAnsi="Arial"/>
                 <w:b w:val="false"/>
                 <w:bCs w:val="false"/>
                 <w:color w:val="212121"/>
-                <w:sz w:val="20"/>
-                <w:szCs w:val="20"/>
+                <w:sz w:val="18"/>
+                <w:szCs w:val="18"/>
               </w:rPr>
               <w:t xml:space="preserve">Native browser/CDN (via URL)</w:t>
             </w:r>
@@ -1352,7 +1421,7 @@
         </w:tc>
         <w:tc>
           <w:tcPr>
-            <w:tcW w:type="dxa" w:w="4680"/>
+            <w:tcW w:type="dxa" w:w="3240"/>
             <w:tcBorders>
               <w:top w:val="single" w:color="BDBDBD" w:sz="1"/>
               <w:left w:val="single" w:color="BDBDBD" w:sz="1"/>
@@ -1361,21 +1430,25 @@
             </w:tcBorders>
             <w:shd w:fill="FFFFFF" w:val="clear"/>
             <w:tcMar>
-              <w:top w:type="dxa" w:w="80"/>
+              <w:top w:type="dxa" w:w="120"/>
               <w:left w:type="dxa" w:w="120"/>
-              <w:bottom w:type="dxa" w:w="80"/>
+              <w:bottom w:type="dxa" w:w="120"/>
               <w:right w:type="dxa" w:w="120"/>
             </w:tcMar>
+            <w:vAlign w:val="center"/>
           </w:tcPr>
           <w:p>
+            <w:pPr>
+              <w:jc w:val="left"/>
+            </w:pPr>
             <w:r>
               <w:rPr>
                 <w:rFonts w:ascii="Arial" w:cs="Arial" w:eastAsia="Arial" w:hAnsi="Arial"/>
                 <w:b w:val="false"/>
                 <w:bCs w:val="false"/>
                 <w:color w:val="212121"/>
-                <w:sz w:val="20"/>
-                <w:szCs w:val="20"/>
+                <w:sz w:val="18"/>
+                <w:szCs w:val="18"/>
               </w:rPr>
               <w:t xml:space="preserve">Complex; requires client-side cache</w:t>
             </w:r>
@@ -2846,7 +2919,7 @@
     </w:p>
     <w:tbl>
       <w:tblPr>
-        <w:tblW w:type="dxa" w:w="9360"/>
+        <w:tblW w:type="dxa" w:w="9720"/>
         <w:tblBorders>
           <w:top w:val="single" w:color="auto" w:sz="4"/>
           <w:left w:val="single" w:color="auto" w:sz="4"/>
@@ -2857,13 +2930,14 @@
         </w:tblBorders>
       </w:tblPr>
       <w:tblGrid>
-        <w:gridCol w:w="4680"/>
-        <w:gridCol w:w="4680"/>
+        <w:gridCol w:w="3240"/>
+        <w:gridCol w:w="3240"/>
+        <w:gridCol w:w="3240"/>
       </w:tblGrid>
       <w:tr>
         <w:tc>
           <w:tcPr>
-            <w:tcW w:type="dxa" w:w="4680"/>
+            <w:tcW w:type="dxa" w:w="3240"/>
             <w:tcBorders>
               <w:top w:val="single" w:color="BDBDBD" w:sz="1"/>
               <w:left w:val="single" w:color="BDBDBD" w:sz="1"/>
@@ -2872,21 +2946,25 @@
             </w:tcBorders>
             <w:shd w:fill="BBDEFB" w:val="clear"/>
             <w:tcMar>
-              <w:top w:type="dxa" w:w="80"/>
+              <w:top w:type="dxa" w:w="120"/>
               <w:left w:type="dxa" w:w="120"/>
-              <w:bottom w:type="dxa" w:w="80"/>
+              <w:bottom w:type="dxa" w:w="120"/>
               <w:right w:type="dxa" w:w="120"/>
             </w:tcMar>
+            <w:vAlign w:val="center"/>
           </w:tcPr>
           <w:p>
+            <w:pPr>
+              <w:jc w:val="left"/>
+            </w:pPr>
             <w:r>
               <w:rPr>
                 <w:rFonts w:ascii="Arial" w:cs="Arial" w:eastAsia="Arial" w:hAnsi="Arial"/>
                 <w:b/>
                 <w:bCs/>
                 <w:color w:val="0D47A1"/>
-                <w:sz w:val="22"/>
-                <w:szCs w:val="22"/>
+                <w:sz w:val="20"/>
+                <w:szCs w:val="20"/>
               </w:rPr>
               <w:t xml:space="preserve">Strategy</w:t>
             </w:r>
@@ -2894,7 +2972,7 @@
         </w:tc>
         <w:tc>
           <w:tcPr>
-            <w:tcW w:type="dxa" w:w="4680"/>
+            <w:tcW w:type="dxa" w:w="3240"/>
             <w:tcBorders>
               <w:top w:val="single" w:color="BDBDBD" w:sz="1"/>
               <w:left w:val="single" w:color="BDBDBD" w:sz="1"/>
@@ -2903,21 +2981,25 @@
             </w:tcBorders>
             <w:shd w:fill="BBDEFB" w:val="clear"/>
             <w:tcMar>
-              <w:top w:type="dxa" w:w="80"/>
+              <w:top w:type="dxa" w:w="120"/>
               <w:left w:type="dxa" w:w="120"/>
-              <w:bottom w:type="dxa" w:w="80"/>
+              <w:bottom w:type="dxa" w:w="120"/>
               <w:right w:type="dxa" w:w="120"/>
             </w:tcMar>
+            <w:vAlign w:val="center"/>
           </w:tcPr>
           <w:p>
+            <w:pPr>
+              <w:jc w:val="left"/>
+            </w:pPr>
             <w:r>
               <w:rPr>
                 <w:rFonts w:ascii="Arial" w:cs="Arial" w:eastAsia="Arial" w:hAnsi="Arial"/>
                 <w:b/>
                 <w:bCs/>
                 <w:color w:val="0D47A1"/>
-                <w:sz w:val="22"/>
-                <w:szCs w:val="22"/>
+                <w:sz w:val="20"/>
+                <w:szCs w:val="20"/>
               </w:rPr>
               <w:t xml:space="preserve">Best For</w:t>
             </w:r>
@@ -2925,7 +3007,7 @@
         </w:tc>
         <w:tc>
           <w:tcPr>
-            <w:tcW w:type="dxa" w:w="4680"/>
+            <w:tcW w:type="dxa" w:w="3240"/>
             <w:tcBorders>
               <w:top w:val="single" w:color="BDBDBD" w:sz="1"/>
               <w:left w:val="single" w:color="BDBDBD" w:sz="1"/>
@@ -2934,21 +3016,25 @@
             </w:tcBorders>
             <w:shd w:fill="BBDEFB" w:val="clear"/>
             <w:tcMar>
-              <w:top w:type="dxa" w:w="80"/>
+              <w:top w:type="dxa" w:w="120"/>
               <w:left w:type="dxa" w:w="120"/>
-              <w:bottom w:type="dxa" w:w="80"/>
+              <w:bottom w:type="dxa" w:w="120"/>
               <w:right w:type="dxa" w:w="120"/>
             </w:tcMar>
+            <w:vAlign w:val="center"/>
           </w:tcPr>
           <w:p>
+            <w:pPr>
+              <w:jc w:val="left"/>
+            </w:pPr>
             <w:r>
               <w:rPr>
                 <w:rFonts w:ascii="Arial" w:cs="Arial" w:eastAsia="Arial" w:hAnsi="Arial"/>
                 <w:b/>
                 <w:bCs/>
                 <w:color w:val="0D47A1"/>
-                <w:sz w:val="22"/>
-                <w:szCs w:val="22"/>
+                <w:sz w:val="20"/>
+                <w:szCs w:val="20"/>
               </w:rPr>
               <w:t xml:space="preserve">Trade-off</w:t>
             </w:r>
@@ -2958,7 +3044,7 @@
       <w:tr>
         <w:tc>
           <w:tcPr>
-            <w:tcW w:type="dxa" w:w="4680"/>
+            <w:tcW w:type="dxa" w:w="3240"/>
             <w:tcBorders>
               <w:top w:val="single" w:color="BDBDBD" w:sz="1"/>
               <w:left w:val="single" w:color="BDBDBD" w:sz="1"/>
@@ -2967,21 +3053,25 @@
             </w:tcBorders>
             <w:shd w:fill="FFFFFF" w:val="clear"/>
             <w:tcMar>
-              <w:top w:type="dxa" w:w="80"/>
+              <w:top w:type="dxa" w:w="120"/>
               <w:left w:type="dxa" w:w="120"/>
-              <w:bottom w:type="dxa" w:w="80"/>
+              <w:bottom w:type="dxa" w:w="120"/>
               <w:right w:type="dxa" w:w="120"/>
             </w:tcMar>
+            <w:vAlign w:val="center"/>
           </w:tcPr>
           <w:p>
+            <w:pPr>
+              <w:jc w:val="left"/>
+            </w:pPr>
             <w:r>
               <w:rPr>
                 <w:rFonts w:ascii="Arial" w:cs="Arial" w:eastAsia="Arial" w:hAnsi="Arial"/>
                 <w:b w:val="false"/>
                 <w:bCs w:val="false"/>
                 <w:color w:val="212121"/>
-                <w:sz w:val="20"/>
-                <w:szCs w:val="20"/>
+                <w:sz w:val="18"/>
+                <w:szCs w:val="18"/>
               </w:rPr>
               <w:t xml:space="preserve">CSR (Client)</w:t>
             </w:r>
@@ -2989,7 +3079,7 @@
         </w:tc>
         <w:tc>
           <w:tcPr>
-            <w:tcW w:type="dxa" w:w="4680"/>
+            <w:tcW w:type="dxa" w:w="3240"/>
             <w:tcBorders>
               <w:top w:val="single" w:color="BDBDBD" w:sz="1"/>
               <w:left w:val="single" w:color="BDBDBD" w:sz="1"/>
@@ -2998,21 +3088,25 @@
             </w:tcBorders>
             <w:shd w:fill="FFFFFF" w:val="clear"/>
             <w:tcMar>
-              <w:top w:type="dxa" w:w="80"/>
+              <w:top w:type="dxa" w:w="120"/>
               <w:left w:type="dxa" w:w="120"/>
-              <w:bottom w:type="dxa" w:w="80"/>
+              <w:bottom w:type="dxa" w:w="120"/>
               <w:right w:type="dxa" w:w="120"/>
             </w:tcMar>
+            <w:vAlign w:val="center"/>
           </w:tcPr>
           <w:p>
+            <w:pPr>
+              <w:jc w:val="left"/>
+            </w:pPr>
             <w:r>
               <w:rPr>
                 <w:rFonts w:ascii="Arial" w:cs="Arial" w:eastAsia="Arial" w:hAnsi="Arial"/>
                 <w:b w:val="false"/>
                 <w:bCs w:val="false"/>
                 <w:color w:val="212121"/>
-                <w:sz w:val="20"/>
-                <w:szCs w:val="20"/>
+                <w:sz w:val="18"/>
+                <w:szCs w:val="18"/>
               </w:rPr>
               <w:t xml:space="preserve">Private dashboards</w:t>
             </w:r>
@@ -3020,7 +3114,7 @@
         </w:tc>
         <w:tc>
           <w:tcPr>
-            <w:tcW w:type="dxa" w:w="4680"/>
+            <w:tcW w:type="dxa" w:w="3240"/>
             <w:tcBorders>
               <w:top w:val="single" w:color="BDBDBD" w:sz="1"/>
               <w:left w:val="single" w:color="BDBDBD" w:sz="1"/>
@@ -3029,21 +3123,25 @@
             </w:tcBorders>
             <w:shd w:fill="FFFFFF" w:val="clear"/>
             <w:tcMar>
-              <w:top w:type="dxa" w:w="80"/>
+              <w:top w:type="dxa" w:w="120"/>
               <w:left w:type="dxa" w:w="120"/>
-              <w:bottom w:type="dxa" w:w="80"/>
+              <w:bottom w:type="dxa" w:w="120"/>
               <w:right w:type="dxa" w:w="120"/>
             </w:tcMar>
+            <w:vAlign w:val="center"/>
           </w:tcPr>
           <w:p>
+            <w:pPr>
+              <w:jc w:val="left"/>
+            </w:pPr>
             <w:r>
               <w:rPr>
                 <w:rFonts w:ascii="Arial" w:cs="Arial" w:eastAsia="Arial" w:hAnsi="Arial"/>
                 <w:b w:val="false"/>
                 <w:bCs w:val="false"/>
                 <w:color w:val="212121"/>
-                <w:sz w:val="20"/>
-                <w:szCs w:val="20"/>
+                <w:sz w:val="18"/>
+                <w:szCs w:val="18"/>
               </w:rPr>
               <w:t xml:space="preserve">Slow first paint, poor SEO</w:t>
             </w:r>
@@ -3053,7 +3151,7 @@
       <w:tr>
         <w:tc>
           <w:tcPr>
-            <w:tcW w:type="dxa" w:w="4680"/>
+            <w:tcW w:type="dxa" w:w="3240"/>
             <w:tcBorders>
               <w:top w:val="single" w:color="BDBDBD" w:sz="1"/>
               <w:left w:val="single" w:color="BDBDBD" w:sz="1"/>
@@ -3062,21 +3160,25 @@
             </w:tcBorders>
             <w:shd w:fill="E3F2FD" w:val="clear"/>
             <w:tcMar>
-              <w:top w:type="dxa" w:w="80"/>
+              <w:top w:type="dxa" w:w="120"/>
               <w:left w:type="dxa" w:w="120"/>
-              <w:bottom w:type="dxa" w:w="80"/>
+              <w:bottom w:type="dxa" w:w="120"/>
               <w:right w:type="dxa" w:w="120"/>
             </w:tcMar>
+            <w:vAlign w:val="center"/>
           </w:tcPr>
           <w:p>
+            <w:pPr>
+              <w:jc w:val="left"/>
+            </w:pPr>
             <w:r>
               <w:rPr>
                 <w:rFonts w:ascii="Arial" w:cs="Arial" w:eastAsia="Arial" w:hAnsi="Arial"/>
                 <w:b w:val="false"/>
                 <w:bCs w:val="false"/>
                 <w:color w:val="212121"/>
-                <w:sz w:val="20"/>
-                <w:szCs w:val="20"/>
+                <w:sz w:val="18"/>
+                <w:szCs w:val="18"/>
               </w:rPr>
               <w:t xml:space="preserve">SSR (Server)</w:t>
             </w:r>
@@ -3084,7 +3186,7 @@
         </w:tc>
         <w:tc>
           <w:tcPr>
-            <w:tcW w:type="dxa" w:w="4680"/>
+            <w:tcW w:type="dxa" w:w="3240"/>
             <w:tcBorders>
               <w:top w:val="single" w:color="BDBDBD" w:sz="1"/>
               <w:left w:val="single" w:color="BDBDBD" w:sz="1"/>
@@ -3093,21 +3195,25 @@
             </w:tcBorders>
             <w:shd w:fill="E3F2FD" w:val="clear"/>
             <w:tcMar>
-              <w:top w:type="dxa" w:w="80"/>
+              <w:top w:type="dxa" w:w="120"/>
               <w:left w:type="dxa" w:w="120"/>
-              <w:bottom w:type="dxa" w:w="80"/>
+              <w:bottom w:type="dxa" w:w="120"/>
               <w:right w:type="dxa" w:w="120"/>
             </w:tcMar>
+            <w:vAlign w:val="center"/>
           </w:tcPr>
           <w:p>
+            <w:pPr>
+              <w:jc w:val="left"/>
+            </w:pPr>
             <w:r>
               <w:rPr>
                 <w:rFonts w:ascii="Arial" w:cs="Arial" w:eastAsia="Arial" w:hAnsi="Arial"/>
                 <w:b w:val="false"/>
                 <w:bCs w:val="false"/>
                 <w:color w:val="212121"/>
-                <w:sz w:val="20"/>
-                <w:szCs w:val="20"/>
+                <w:sz w:val="18"/>
+                <w:szCs w:val="18"/>
               </w:rPr>
               <w:t xml:space="preserve">Dynamic news/feeds</w:t>
             </w:r>
@@ -3115,7 +3221,7 @@
         </w:tc>
         <w:tc>
           <w:tcPr>
-            <w:tcW w:type="dxa" w:w="4680"/>
+            <w:tcW w:type="dxa" w:w="3240"/>
             <w:tcBorders>
               <w:top w:val="single" w:color="BDBDBD" w:sz="1"/>
               <w:left w:val="single" w:color="BDBDBD" w:sz="1"/>
@@ -3124,21 +3230,25 @@
             </w:tcBorders>
             <w:shd w:fill="E3F2FD" w:val="clear"/>
             <w:tcMar>
-              <w:top w:type="dxa" w:w="80"/>
+              <w:top w:type="dxa" w:w="120"/>
               <w:left w:type="dxa" w:w="120"/>
-              <w:bottom w:type="dxa" w:w="80"/>
+              <w:bottom w:type="dxa" w:w="120"/>
               <w:right w:type="dxa" w:w="120"/>
             </w:tcMar>
+            <w:vAlign w:val="center"/>
           </w:tcPr>
           <w:p>
+            <w:pPr>
+              <w:jc w:val="left"/>
+            </w:pPr>
             <w:r>
               <w:rPr>
                 <w:rFonts w:ascii="Arial" w:cs="Arial" w:eastAsia="Arial" w:hAnsi="Arial"/>
                 <w:b w:val="false"/>
                 <w:bCs w:val="false"/>
                 <w:color w:val="212121"/>
-                <w:sz w:val="20"/>
-                <w:szCs w:val="20"/>
+                <w:sz w:val="18"/>
+                <w:szCs w:val="18"/>
               </w:rPr>
               <w:t xml:space="preserve">Higher server load, TTFB delay</w:t>
             </w:r>
@@ -3148,7 +3258,7 @@
       <w:tr>
         <w:tc>
           <w:tcPr>
-            <w:tcW w:type="dxa" w:w="4680"/>
+            <w:tcW w:type="dxa" w:w="3240"/>
             <w:tcBorders>
               <w:top w:val="single" w:color="BDBDBD" w:sz="1"/>
               <w:left w:val="single" w:color="BDBDBD" w:sz="1"/>
@@ -3157,21 +3267,25 @@
             </w:tcBorders>
             <w:shd w:fill="FFFFFF" w:val="clear"/>
             <w:tcMar>
-              <w:top w:type="dxa" w:w="80"/>
+              <w:top w:type="dxa" w:w="120"/>
               <w:left w:type="dxa" w:w="120"/>
-              <w:bottom w:type="dxa" w:w="80"/>
+              <w:bottom w:type="dxa" w:w="120"/>
               <w:right w:type="dxa" w:w="120"/>
             </w:tcMar>
+            <w:vAlign w:val="center"/>
           </w:tcPr>
           <w:p>
+            <w:pPr>
+              <w:jc w:val="left"/>
+            </w:pPr>
             <w:r>
               <w:rPr>
                 <w:rFonts w:ascii="Arial" w:cs="Arial" w:eastAsia="Arial" w:hAnsi="Arial"/>
                 <w:b w:val="false"/>
                 <w:bCs w:val="false"/>
                 <w:color w:val="212121"/>
-                <w:sz w:val="20"/>
-                <w:szCs w:val="20"/>
+                <w:sz w:val="18"/>
+                <w:szCs w:val="18"/>
               </w:rPr>
               <w:t xml:space="preserve">SSG (Static)</w:t>
             </w:r>
@@ -3179,7 +3293,7 @@
         </w:tc>
         <w:tc>
           <w:tcPr>
-            <w:tcW w:type="dxa" w:w="4680"/>
+            <w:tcW w:type="dxa" w:w="3240"/>
             <w:tcBorders>
               <w:top w:val="single" w:color="BDBDBD" w:sz="1"/>
               <w:left w:val="single" w:color="BDBDBD" w:sz="1"/>
@@ -3188,21 +3302,25 @@
             </w:tcBorders>
             <w:shd w:fill="FFFFFF" w:val="clear"/>
             <w:tcMar>
-              <w:top w:type="dxa" w:w="80"/>
+              <w:top w:type="dxa" w:w="120"/>
               <w:left w:type="dxa" w:w="120"/>
-              <w:bottom w:type="dxa" w:w="80"/>
+              <w:bottom w:type="dxa" w:w="120"/>
               <w:right w:type="dxa" w:w="120"/>
             </w:tcMar>
+            <w:vAlign w:val="center"/>
           </w:tcPr>
           <w:p>
+            <w:pPr>
+              <w:jc w:val="left"/>
+            </w:pPr>
             <w:r>
               <w:rPr>
                 <w:rFonts w:ascii="Arial" w:cs="Arial" w:eastAsia="Arial" w:hAnsi="Arial"/>
                 <w:b w:val="false"/>
                 <w:bCs w:val="false"/>
                 <w:color w:val="212121"/>
-                <w:sz w:val="20"/>
-                <w:szCs w:val="20"/>
+                <w:sz w:val="18"/>
+                <w:szCs w:val="18"/>
               </w:rPr>
               <w:t xml:space="preserve">Blogs, Marketing sites</w:t>
             </w:r>
@@ -3210,7 +3328,7 @@
         </w:tc>
         <w:tc>
           <w:tcPr>
-            <w:tcW w:type="dxa" w:w="4680"/>
+            <w:tcW w:type="dxa" w:w="3240"/>
             <w:tcBorders>
               <w:top w:val="single" w:color="BDBDBD" w:sz="1"/>
               <w:left w:val="single" w:color="BDBDBD" w:sz="1"/>
@@ -3219,21 +3337,25 @@
             </w:tcBorders>
             <w:shd w:fill="FFFFFF" w:val="clear"/>
             <w:tcMar>
-              <w:top w:type="dxa" w:w="80"/>
+              <w:top w:type="dxa" w:w="120"/>
               <w:left w:type="dxa" w:w="120"/>
-              <w:bottom w:type="dxa" w:w="80"/>
+              <w:bottom w:type="dxa" w:w="120"/>
               <w:right w:type="dxa" w:w="120"/>
             </w:tcMar>
+            <w:vAlign w:val="center"/>
           </w:tcPr>
           <w:p>
+            <w:pPr>
+              <w:jc w:val="left"/>
+            </w:pPr>
             <w:r>
               <w:rPr>
                 <w:rFonts w:ascii="Arial" w:cs="Arial" w:eastAsia="Arial" w:hAnsi="Arial"/>
                 <w:b w:val="false"/>
                 <w:bCs w:val="false"/>
                 <w:color w:val="212121"/>
-                <w:sz w:val="20"/>
-                <w:szCs w:val="20"/>
+                <w:sz w:val="18"/>
+                <w:szCs w:val="18"/>
               </w:rPr>
               <w:t xml:space="preserve">Build time grows with pages</w:t>
             </w:r>
@@ -3243,7 +3365,7 @@
       <w:tr>
         <w:tc>
           <w:tcPr>
-            <w:tcW w:type="dxa" w:w="4680"/>
+            <w:tcW w:type="dxa" w:w="3240"/>
             <w:tcBorders>
               <w:top w:val="single" w:color="BDBDBD" w:sz="1"/>
               <w:left w:val="single" w:color="BDBDBD" w:sz="1"/>
@@ -3252,21 +3374,25 @@
             </w:tcBorders>
             <w:shd w:fill="E3F2FD" w:val="clear"/>
             <w:tcMar>
-              <w:top w:type="dxa" w:w="80"/>
+              <w:top w:type="dxa" w:w="120"/>
               <w:left w:type="dxa" w:w="120"/>
-              <w:bottom w:type="dxa" w:w="80"/>
+              <w:bottom w:type="dxa" w:w="120"/>
               <w:right w:type="dxa" w:w="120"/>
             </w:tcMar>
+            <w:vAlign w:val="center"/>
           </w:tcPr>
           <w:p>
+            <w:pPr>
+              <w:jc w:val="left"/>
+            </w:pPr>
             <w:r>
               <w:rPr>
                 <w:rFonts w:ascii="Arial" w:cs="Arial" w:eastAsia="Arial" w:hAnsi="Arial"/>
                 <w:b w:val="false"/>
                 <w:bCs w:val="false"/>
                 <w:color w:val="212121"/>
-                <w:sz w:val="20"/>
-                <w:szCs w:val="20"/>
+                <w:sz w:val="18"/>
+                <w:szCs w:val="18"/>
               </w:rPr>
               <w:t xml:space="preserve">ISR (Incremental)</w:t>
             </w:r>
@@ -3274,7 +3400,7 @@
         </w:tc>
         <w:tc>
           <w:tcPr>
-            <w:tcW w:type="dxa" w:w="4680"/>
+            <w:tcW w:type="dxa" w:w="3240"/>
             <w:tcBorders>
               <w:top w:val="single" w:color="BDBDBD" w:sz="1"/>
               <w:left w:val="single" w:color="BDBDBD" w:sz="1"/>
@@ -3283,21 +3409,25 @@
             </w:tcBorders>
             <w:shd w:fill="E3F2FD" w:val="clear"/>
             <w:tcMar>
-              <w:top w:type="dxa" w:w="80"/>
+              <w:top w:type="dxa" w:w="120"/>
               <w:left w:type="dxa" w:w="120"/>
-              <w:bottom w:type="dxa" w:w="80"/>
+              <w:bottom w:type="dxa" w:w="120"/>
               <w:right w:type="dxa" w:w="120"/>
             </w:tcMar>
+            <w:vAlign w:val="center"/>
           </w:tcPr>
           <w:p>
+            <w:pPr>
+              <w:jc w:val="left"/>
+            </w:pPr>
             <w:r>
               <w:rPr>
                 <w:rFonts w:ascii="Arial" w:cs="Arial" w:eastAsia="Arial" w:hAnsi="Arial"/>
                 <w:b w:val="false"/>
                 <w:bCs w:val="false"/>
                 <w:color w:val="212121"/>
-                <w:sz w:val="20"/>
-                <w:szCs w:val="20"/>
+                <w:sz w:val="18"/>
+                <w:szCs w:val="18"/>
               </w:rPr>
               <w:t xml:space="preserve">E-commerce catalogs</w:t>
             </w:r>
@@ -3305,7 +3435,7 @@
         </w:tc>
         <w:tc>
           <w:tcPr>
-            <w:tcW w:type="dxa" w:w="4680"/>
+            <w:tcW w:type="dxa" w:w="3240"/>
             <w:tcBorders>
               <w:top w:val="single" w:color="BDBDBD" w:sz="1"/>
               <w:left w:val="single" w:color="BDBDBD" w:sz="1"/>
@@ -3314,21 +3444,25 @@
             </w:tcBorders>
             <w:shd w:fill="E3F2FD" w:val="clear"/>
             <w:tcMar>
-              <w:top w:type="dxa" w:w="80"/>
+              <w:top w:type="dxa" w:w="120"/>
               <w:left w:type="dxa" w:w="120"/>
-              <w:bottom w:type="dxa" w:w="80"/>
+              <w:bottom w:type="dxa" w:w="120"/>
               <w:right w:type="dxa" w:w="120"/>
             </w:tcMar>
+            <w:vAlign w:val="center"/>
           </w:tcPr>
           <w:p>
+            <w:pPr>
+              <w:jc w:val="left"/>
+            </w:pPr>
             <w:r>
               <w:rPr>
                 <w:rFonts w:ascii="Arial" w:cs="Arial" w:eastAsia="Arial" w:hAnsi="Arial"/>
                 <w:b w:val="false"/>
                 <w:bCs w:val="false"/>
                 <w:color w:val="212121"/>
-                <w:sz w:val="20"/>
-                <w:szCs w:val="20"/>
+                <w:sz w:val="18"/>
+                <w:szCs w:val="18"/>
               </w:rPr>
               <w:t xml:space="preserve">Complex cache invalidation logic</w:t>
             </w:r>

</xml_diff>

<commit_message>
Add more code snippets
</commit_message>
<xml_diff>
--- a/React_Frontend_2026.docx
+++ b/React_Frontend_2026.docx
@@ -1289,6 +1289,72 @@
     </w:p>
     <w:p>
       <w:pPr>
+        <w:shd w:fill="F5F5F5" w:val="clear"/>
+        <w:spacing w:after="80" w:before="60"/>
+        <w:ind w:left="360" w:right="360"/>
+      </w:pPr>
+      <w:r>
+        <w:rPr>
+          <w:rFonts w:ascii="Courier New" w:cs="Courier New" w:eastAsia="Courier New" w:hAnsi="Courier New"/>
+          <w:color w:val="C62828"/>
+          <w:sz w:val="18"/>
+          <w:szCs w:val="18"/>
+        </w:rPr>
+        <w:t xml:space="preserve">const observer = new IntersectionObserver((entries) =&gt; {</w:t>
+      </w:r>
+      <w:r>
+        <w:rPr>
+          <w:rFonts w:ascii="Courier New" w:cs="Courier New" w:eastAsia="Courier New" w:hAnsi="Courier New"/>
+          <w:color w:val="C62828"/>
+          <w:sz w:val="18"/>
+          <w:szCs w:val="18"/>
+        </w:rPr>
+        <w:br/>
+        <w:t xml:space="preserve">  if (entries[0].isIntersecting &amp;&amp; hasMore) {</w:t>
+      </w:r>
+      <w:r>
+        <w:rPr>
+          <w:rFonts w:ascii="Courier New" w:cs="Courier New" w:eastAsia="Courier New" w:hAnsi="Courier New"/>
+          <w:color w:val="C62828"/>
+          <w:sz w:val="18"/>
+          <w:szCs w:val="18"/>
+        </w:rPr>
+        <w:br/>
+        <w:t xml:space="preserve">    fetchNextPage();</w:t>
+      </w:r>
+      <w:r>
+        <w:rPr>
+          <w:rFonts w:ascii="Courier New" w:cs="Courier New" w:eastAsia="Courier New" w:hAnsi="Courier New"/>
+          <w:color w:val="C62828"/>
+          <w:sz w:val="18"/>
+          <w:szCs w:val="18"/>
+        </w:rPr>
+        <w:br/>
+        <w:t xml:space="preserve">  }</w:t>
+      </w:r>
+      <w:r>
+        <w:rPr>
+          <w:rFonts w:ascii="Courier New" w:cs="Courier New" w:eastAsia="Courier New" w:hAnsi="Courier New"/>
+          <w:color w:val="C62828"/>
+          <w:sz w:val="18"/>
+          <w:szCs w:val="18"/>
+        </w:rPr>
+        <w:br/>
+        <w:t xml:space="preserve">});</w:t>
+      </w:r>
+      <w:r>
+        <w:rPr>
+          <w:rFonts w:ascii="Courier New" w:cs="Courier New" w:eastAsia="Courier New" w:hAnsi="Courier New"/>
+          <w:color w:val="C62828"/>
+          <w:sz w:val="18"/>
+          <w:szCs w:val="18"/>
+        </w:rPr>
+        <w:br/>
+        <w:t xml:space="preserve">observer.observe(sentinelRef.current);</w:t>
+      </w:r>
+    </w:p>
+    <w:p>
+      <w:pPr>
         <w:spacing w:after="40" w:before="40"/>
       </w:pPr>
       <w:r>
@@ -1740,6 +1806,62 @@
           <w:szCs w:val="22"/>
         </w:rPr>
         <w:t xml:space="preserve">Security: Use 'wss://' (TLS) to prevent injection attacks and snooping.</w:t>
+      </w:r>
+    </w:p>
+    <w:p>
+      <w:pPr>
+        <w:shd w:fill="F5F5F5" w:val="clear"/>
+        <w:spacing w:after="80" w:before="60"/>
+        <w:ind w:left="360" w:right="360"/>
+      </w:pPr>
+      <w:r>
+        <w:rPr>
+          <w:rFonts w:ascii="Courier New" w:cs="Courier New" w:eastAsia="Courier New" w:hAnsi="Courier New"/>
+          <w:color w:val="C62828"/>
+          <w:sz w:val="18"/>
+          <w:szCs w:val="18"/>
+        </w:rPr>
+        <w:t xml:space="preserve">const socket = new WebSocket('wss://example.com/socket');</w:t>
+      </w:r>
+      <w:r>
+        <w:rPr>
+          <w:rFonts w:ascii="Courier New" w:cs="Courier New" w:eastAsia="Courier New" w:hAnsi="Courier New"/>
+          <w:color w:val="C62828"/>
+          <w:sz w:val="18"/>
+          <w:szCs w:val="18"/>
+        </w:rPr>
+        <w:br/>
+        <w:t xml:space="preserve">socket.onmessage = (event) =&gt; {</w:t>
+      </w:r>
+      <w:r>
+        <w:rPr>
+          <w:rFonts w:ascii="Courier New" w:cs="Courier New" w:eastAsia="Courier New" w:hAnsi="Courier New"/>
+          <w:color w:val="C62828"/>
+          <w:sz w:val="18"/>
+          <w:szCs w:val="18"/>
+        </w:rPr>
+        <w:br/>
+        <w:t xml:space="preserve">  console.log('Message from server:', event.data);</w:t>
+      </w:r>
+      <w:r>
+        <w:rPr>
+          <w:rFonts w:ascii="Courier New" w:cs="Courier New" w:eastAsia="Courier New" w:hAnsi="Courier New"/>
+          <w:color w:val="C62828"/>
+          <w:sz w:val="18"/>
+          <w:szCs w:val="18"/>
+        </w:rPr>
+        <w:br/>
+        <w:t xml:space="preserve">};</w:t>
+      </w:r>
+      <w:r>
+        <w:rPr>
+          <w:rFonts w:ascii="Courier New" w:cs="Courier New" w:eastAsia="Courier New" w:hAnsi="Courier New"/>
+          <w:color w:val="C62828"/>
+          <w:sz w:val="18"/>
+          <w:szCs w:val="18"/>
+        </w:rPr>
+        <w:br/>
+        <w:t xml:space="preserve">socket.send(JSON.stringify({ type: 'GREETING', payload: 'Hello Server!' }));</w:t>
       </w:r>
     </w:p>
     <w:p>
@@ -2517,6 +2639,102 @@
     </w:p>
     <w:p>
       <w:pPr>
+        <w:shd w:fill="F5F5F5" w:val="clear"/>
+        <w:spacing w:after="80" w:before="60"/>
+        <w:ind w:left="360" w:right="360"/>
+      </w:pPr>
+      <w:r>
+        <w:rPr>
+          <w:rFonts w:ascii="Courier New" w:cs="Courier New" w:eastAsia="Courier New" w:hAnsi="Courier New"/>
+          <w:color w:val="C62828"/>
+          <w:sz w:val="18"/>
+          <w:szCs w:val="18"/>
+        </w:rPr>
+        <w:t xml:space="preserve">query GetUserPosts($userId: ID!) {</w:t>
+      </w:r>
+      <w:r>
+        <w:rPr>
+          <w:rFonts w:ascii="Courier New" w:cs="Courier New" w:eastAsia="Courier New" w:hAnsi="Courier New"/>
+          <w:color w:val="C62828"/>
+          <w:sz w:val="18"/>
+          <w:szCs w:val="18"/>
+        </w:rPr>
+        <w:br/>
+        <w:t xml:space="preserve">  user(id: $userId) {</w:t>
+      </w:r>
+      <w:r>
+        <w:rPr>
+          <w:rFonts w:ascii="Courier New" w:cs="Courier New" w:eastAsia="Courier New" w:hAnsi="Courier New"/>
+          <w:color w:val="C62828"/>
+          <w:sz w:val="18"/>
+          <w:szCs w:val="18"/>
+        </w:rPr>
+        <w:br/>
+        <w:t xml:space="preserve">    name</w:t>
+      </w:r>
+      <w:r>
+        <w:rPr>
+          <w:rFonts w:ascii="Courier New" w:cs="Courier New" w:eastAsia="Courier New" w:hAnsi="Courier New"/>
+          <w:color w:val="C62828"/>
+          <w:sz w:val="18"/>
+          <w:szCs w:val="18"/>
+        </w:rPr>
+        <w:br/>
+        <w:t xml:space="preserve">    posts {</w:t>
+      </w:r>
+      <w:r>
+        <w:rPr>
+          <w:rFonts w:ascii="Courier New" w:cs="Courier New" w:eastAsia="Courier New" w:hAnsi="Courier New"/>
+          <w:color w:val="C62828"/>
+          <w:sz w:val="18"/>
+          <w:szCs w:val="18"/>
+        </w:rPr>
+        <w:br/>
+        <w:t xml:space="preserve">      title</w:t>
+      </w:r>
+      <w:r>
+        <w:rPr>
+          <w:rFonts w:ascii="Courier New" w:cs="Courier New" w:eastAsia="Courier New" w:hAnsi="Courier New"/>
+          <w:color w:val="C62828"/>
+          <w:sz w:val="18"/>
+          <w:szCs w:val="18"/>
+        </w:rPr>
+        <w:br/>
+        <w:t xml:space="preserve">      comments { text }</w:t>
+      </w:r>
+      <w:r>
+        <w:rPr>
+          <w:rFonts w:ascii="Courier New" w:cs="Courier New" w:eastAsia="Courier New" w:hAnsi="Courier New"/>
+          <w:color w:val="C62828"/>
+          <w:sz w:val="18"/>
+          <w:szCs w:val="18"/>
+        </w:rPr>
+        <w:br/>
+        <w:t xml:space="preserve">    }</w:t>
+      </w:r>
+      <w:r>
+        <w:rPr>
+          <w:rFonts w:ascii="Courier New" w:cs="Courier New" w:eastAsia="Courier New" w:hAnsi="Courier New"/>
+          <w:color w:val="C62828"/>
+          <w:sz w:val="18"/>
+          <w:szCs w:val="18"/>
+        </w:rPr>
+        <w:br/>
+        <w:t xml:space="preserve">  }</w:t>
+      </w:r>
+      <w:r>
+        <w:rPr>
+          <w:rFonts w:ascii="Courier New" w:cs="Courier New" w:eastAsia="Courier New" w:hAnsi="Courier New"/>
+          <w:color w:val="C62828"/>
+          <w:sz w:val="18"/>
+          <w:szCs w:val="18"/>
+        </w:rPr>
+        <w:br/>
+        <w:t xml:space="preserve">}</w:t>
+      </w:r>
+    </w:p>
+    <w:p>
+      <w:pPr>
         <w:spacing w:after="40" w:before="40"/>
       </w:pPr>
       <w:r>
@@ -2685,6 +2903,62 @@
     </w:p>
     <w:p>
       <w:pPr>
+        <w:shd w:fill="F5F5F5" w:val="clear"/>
+        <w:spacing w:after="80" w:before="60"/>
+        <w:ind w:left="360" w:right="360"/>
+      </w:pPr>
+      <w:r>
+        <w:rPr>
+          <w:rFonts w:ascii="Courier New" w:cs="Courier New" w:eastAsia="Courier New" w:hAnsi="Courier New"/>
+          <w:color w:val="C62828"/>
+          <w:sz w:val="18"/>
+          <w:szCs w:val="18"/>
+        </w:rPr>
+        <w:t xml:space="preserve">// Local Storage</w:t>
+      </w:r>
+      <w:r>
+        <w:rPr>
+          <w:rFonts w:ascii="Courier New" w:cs="Courier New" w:eastAsia="Courier New" w:hAnsi="Courier New"/>
+          <w:color w:val="C62828"/>
+          <w:sz w:val="18"/>
+          <w:szCs w:val="18"/>
+        </w:rPr>
+        <w:br/>
+        <w:t xml:space="preserve">localStorage.setItem('theme', 'dark');</w:t>
+      </w:r>
+      <w:r>
+        <w:rPr>
+          <w:rFonts w:ascii="Courier New" w:cs="Courier New" w:eastAsia="Courier New" w:hAnsi="Courier New"/>
+          <w:color w:val="C62828"/>
+          <w:sz w:val="18"/>
+          <w:szCs w:val="18"/>
+        </w:rPr>
+        <w:br/>
+        <w:t xml:space="preserve"/>
+      </w:r>
+      <w:r>
+        <w:rPr>
+          <w:rFonts w:ascii="Courier New" w:cs="Courier New" w:eastAsia="Courier New" w:hAnsi="Courier New"/>
+          <w:color w:val="C62828"/>
+          <w:sz w:val="18"/>
+          <w:szCs w:val="18"/>
+        </w:rPr>
+        <w:br/>
+        <w:t xml:space="preserve">// Cookie (Secure, HttpOnly usually set by server)</w:t>
+      </w:r>
+      <w:r>
+        <w:rPr>
+          <w:rFonts w:ascii="Courier New" w:cs="Courier New" w:eastAsia="Courier New" w:hAnsi="Courier New"/>
+          <w:color w:val="C62828"/>
+          <w:sz w:val="18"/>
+          <w:szCs w:val="18"/>
+        </w:rPr>
+        <w:br/>
+        <w:t xml:space="preserve">document.cookie = "user_pref=dark; SameSite=Strict; Secure";</w:t>
+      </w:r>
+    </w:p>
+    <w:p>
+      <w:pPr>
         <w:spacing w:after="40" w:before="40"/>
       </w:pPr>
       <w:r>
@@ -2853,6 +3127,82 @@
     </w:p>
     <w:p>
       <w:pPr>
+        <w:shd w:fill="F5F5F5" w:val="clear"/>
+        <w:spacing w:after="80" w:before="60"/>
+        <w:ind w:left="360" w:right="360"/>
+      </w:pPr>
+      <w:r>
+        <w:rPr>
+          <w:rFonts w:ascii="Courier New" w:cs="Courier New" w:eastAsia="Courier New" w:hAnsi="Courier New"/>
+          <w:color w:val="C62828"/>
+          <w:sz w:val="18"/>
+          <w:szCs w:val="18"/>
+        </w:rPr>
+        <w:t xml:space="preserve">// Example JWT Payload (decoded)</w:t>
+      </w:r>
+      <w:r>
+        <w:rPr>
+          <w:rFonts w:ascii="Courier New" w:cs="Courier New" w:eastAsia="Courier New" w:hAnsi="Courier New"/>
+          <w:color w:val="C62828"/>
+          <w:sz w:val="18"/>
+          <w:szCs w:val="18"/>
+        </w:rPr>
+        <w:br/>
+        <w:t xml:space="preserve">{</w:t>
+      </w:r>
+      <w:r>
+        <w:rPr>
+          <w:rFonts w:ascii="Courier New" w:cs="Courier New" w:eastAsia="Courier New" w:hAnsi="Courier New"/>
+          <w:color w:val="C62828"/>
+          <w:sz w:val="18"/>
+          <w:szCs w:val="18"/>
+        </w:rPr>
+        <w:br/>
+        <w:t xml:space="preserve">  "sub": "1234567890",</w:t>
+      </w:r>
+      <w:r>
+        <w:rPr>
+          <w:rFonts w:ascii="Courier New" w:cs="Courier New" w:eastAsia="Courier New" w:hAnsi="Courier New"/>
+          <w:color w:val="C62828"/>
+          <w:sz w:val="18"/>
+          <w:szCs w:val="18"/>
+        </w:rPr>
+        <w:br/>
+        <w:t xml:space="preserve">  "name": "John Doe",</w:t>
+      </w:r>
+      <w:r>
+        <w:rPr>
+          <w:rFonts w:ascii="Courier New" w:cs="Courier New" w:eastAsia="Courier New" w:hAnsi="Courier New"/>
+          <w:color w:val="C62828"/>
+          <w:sz w:val="18"/>
+          <w:szCs w:val="18"/>
+        </w:rPr>
+        <w:br/>
+        <w:t xml:space="preserve">  "role": "admin",</w:t>
+      </w:r>
+      <w:r>
+        <w:rPr>
+          <w:rFonts w:ascii="Courier New" w:cs="Courier New" w:eastAsia="Courier New" w:hAnsi="Courier New"/>
+          <w:color w:val="C62828"/>
+          <w:sz w:val="18"/>
+          <w:szCs w:val="18"/>
+        </w:rPr>
+        <w:br/>
+        <w:t xml:space="preserve">  "iat": 1516239022</w:t>
+      </w:r>
+      <w:r>
+        <w:rPr>
+          <w:rFonts w:ascii="Courier New" w:cs="Courier New" w:eastAsia="Courier New" w:hAnsi="Courier New"/>
+          <w:color w:val="C62828"/>
+          <w:sz w:val="18"/>
+          <w:szCs w:val="18"/>
+        </w:rPr>
+        <w:br/>
+        <w:t xml:space="preserve">}</w:t>
+      </w:r>
+    </w:p>
+    <w:p>
+      <w:pPr>
         <w:spacing w:after="40" w:before="40"/>
       </w:pPr>
       <w:r>
@@ -3021,6 +3371,82 @@
     </w:p>
     <w:p>
       <w:pPr>
+        <w:shd w:fill="F5F5F5" w:val="clear"/>
+        <w:spacing w:after="80" w:before="60"/>
+        <w:ind w:left="360" w:right="360"/>
+      </w:pPr>
+      <w:r>
+        <w:rPr>
+          <w:rFonts w:ascii="Courier New" w:cs="Courier New" w:eastAsia="Courier New" w:hAnsi="Courier New"/>
+          <w:color w:val="C62828"/>
+          <w:sz w:val="18"/>
+          <w:szCs w:val="18"/>
+        </w:rPr>
+        <w:t xml:space="preserve">const counterSlice = createSlice({</w:t>
+      </w:r>
+      <w:r>
+        <w:rPr>
+          <w:rFonts w:ascii="Courier New" w:cs="Courier New" w:eastAsia="Courier New" w:hAnsi="Courier New"/>
+          <w:color w:val="C62828"/>
+          <w:sz w:val="18"/>
+          <w:szCs w:val="18"/>
+        </w:rPr>
+        <w:br/>
+        <w:t xml:space="preserve">  name: 'counter',</w:t>
+      </w:r>
+      <w:r>
+        <w:rPr>
+          <w:rFonts w:ascii="Courier New" w:cs="Courier New" w:eastAsia="Courier New" w:hAnsi="Courier New"/>
+          <w:color w:val="C62828"/>
+          <w:sz w:val="18"/>
+          <w:szCs w:val="18"/>
+        </w:rPr>
+        <w:br/>
+        <w:t xml:space="preserve">  initialState: { value: 0 },</w:t>
+      </w:r>
+      <w:r>
+        <w:rPr>
+          <w:rFonts w:ascii="Courier New" w:cs="Courier New" w:eastAsia="Courier New" w:hAnsi="Courier New"/>
+          <w:color w:val="C62828"/>
+          <w:sz w:val="18"/>
+          <w:szCs w:val="18"/>
+        </w:rPr>
+        <w:br/>
+        <w:t xml:space="preserve">  reducers: {</w:t>
+      </w:r>
+      <w:r>
+        <w:rPr>
+          <w:rFonts w:ascii="Courier New" w:cs="Courier New" w:eastAsia="Courier New" w:hAnsi="Courier New"/>
+          <w:color w:val="C62828"/>
+          <w:sz w:val="18"/>
+          <w:szCs w:val="18"/>
+        </w:rPr>
+        <w:br/>
+        <w:t xml:space="preserve">    increment: state =&gt; { state.value += 1 }</w:t>
+      </w:r>
+      <w:r>
+        <w:rPr>
+          <w:rFonts w:ascii="Courier New" w:cs="Courier New" w:eastAsia="Courier New" w:hAnsi="Courier New"/>
+          <w:color w:val="C62828"/>
+          <w:sz w:val="18"/>
+          <w:szCs w:val="18"/>
+        </w:rPr>
+        <w:br/>
+        <w:t xml:space="preserve">  }</w:t>
+      </w:r>
+      <w:r>
+        <w:rPr>
+          <w:rFonts w:ascii="Courier New" w:cs="Courier New" w:eastAsia="Courier New" w:hAnsi="Courier New"/>
+          <w:color w:val="C62828"/>
+          <w:sz w:val="18"/>
+          <w:szCs w:val="18"/>
+        </w:rPr>
+        <w:br/>
+        <w:t xml:space="preserve">});</w:t>
+      </w:r>
+    </w:p>
+    <w:p>
+      <w:pPr>
         <w:spacing w:after="40" w:before="40"/>
       </w:pPr>
       <w:r>
@@ -3319,6 +3745,62 @@
     </w:p>
     <w:p>
       <w:pPr>
+        <w:shd w:fill="F5F5F5" w:val="clear"/>
+        <w:spacing w:after="80" w:before="60"/>
+        <w:ind w:left="360" w:right="360"/>
+      </w:pPr>
+      <w:r>
+        <w:rPr>
+          <w:rFonts w:ascii="Courier New" w:cs="Courier New" w:eastAsia="Courier New" w:hAnsi="Courier New"/>
+          <w:color w:val="C62828"/>
+          <w:sz w:val="18"/>
+          <w:szCs w:val="18"/>
+        </w:rPr>
+        <w:t xml:space="preserve">// Component-level splitting</w:t>
+      </w:r>
+      <w:r>
+        <w:rPr>
+          <w:rFonts w:ascii="Courier New" w:cs="Courier New" w:eastAsia="Courier New" w:hAnsi="Courier New"/>
+          <w:color w:val="C62828"/>
+          <w:sz w:val="18"/>
+          <w:szCs w:val="18"/>
+        </w:rPr>
+        <w:br/>
+        <w:t xml:space="preserve">const RichTextEditor = React.lazy(() =&gt; import('./RichTextEditor'));</w:t>
+      </w:r>
+      <w:r>
+        <w:rPr>
+          <w:rFonts w:ascii="Courier New" w:cs="Courier New" w:eastAsia="Courier New" w:hAnsi="Courier New"/>
+          <w:color w:val="C62828"/>
+          <w:sz w:val="18"/>
+          <w:szCs w:val="18"/>
+        </w:rPr>
+        <w:br/>
+        <w:t xml:space="preserve"/>
+      </w:r>
+      <w:r>
+        <w:rPr>
+          <w:rFonts w:ascii="Courier New" w:cs="Courier New" w:eastAsia="Courier New" w:hAnsi="Courier New"/>
+          <w:color w:val="C62828"/>
+          <w:sz w:val="18"/>
+          <w:szCs w:val="18"/>
+        </w:rPr>
+        <w:br/>
+        <w:t xml:space="preserve">// Logic splitting</w:t>
+      </w:r>
+      <w:r>
+        <w:rPr>
+          <w:rFonts w:ascii="Courier New" w:cs="Courier New" w:eastAsia="Courier New" w:hAnsi="Courier New"/>
+          <w:color w:val="C62828"/>
+          <w:sz w:val="18"/>
+          <w:szCs w:val="18"/>
+        </w:rPr>
+        <w:br/>
+        <w:t xml:space="preserve">import('./analytics').then(module =&gt; module.sendEvent('page_view'));</w:t>
+      </w:r>
+    </w:p>
+    <w:p>
+      <w:pPr>
         <w:spacing w:after="40" w:before="40"/>
       </w:pPr>
       <w:r>
@@ -3451,6 +3933,32 @@
     </w:p>
     <w:p>
       <w:pPr>
+        <w:shd w:fill="F5F5F5" w:val="clear"/>
+        <w:spacing w:after="80" w:before="60"/>
+        <w:ind w:left="360" w:right="360"/>
+      </w:pPr>
+      <w:r>
+        <w:rPr>
+          <w:rFonts w:ascii="Courier New" w:cs="Courier New" w:eastAsia="Courier New" w:hAnsi="Courier New"/>
+          <w:color w:val="C62828"/>
+          <w:sz w:val="18"/>
+          <w:szCs w:val="18"/>
+        </w:rPr>
+        <w:t xml:space="preserve">// terminal command to analyze bundle</w:t>
+      </w:r>
+      <w:r>
+        <w:rPr>
+          <w:rFonts w:ascii="Courier New" w:cs="Courier New" w:eastAsia="Courier New" w:hAnsi="Courier New"/>
+          <w:color w:val="C62828"/>
+          <w:sz w:val="18"/>
+          <w:szCs w:val="18"/>
+        </w:rPr>
+        <w:br/>
+        <w:t xml:space="preserve">npx webpack-bundle-analyzer build/stats.json</w:t>
+      </w:r>
+    </w:p>
+    <w:p>
+      <w:pPr>
         <w:spacing w:after="40" w:before="40"/>
       </w:pPr>
       <w:r>
@@ -3584,6 +4092,62 @@
     </w:p>
     <w:p>
       <w:pPr>
+        <w:shd w:fill="F5F5F5" w:val="clear"/>
+        <w:spacing w:after="80" w:before="60"/>
+        <w:ind w:left="360" w:right="360"/>
+      </w:pPr>
+      <w:r>
+        <w:rPr>
+          <w:rFonts w:ascii="Courier New" w:cs="Courier New" w:eastAsia="Courier New" w:hAnsi="Courier New"/>
+          <w:color w:val="C62828"/>
+          <w:sz w:val="18"/>
+          <w:szCs w:val="18"/>
+        </w:rPr>
+        <w:t xml:space="preserve">// Good (Tree-shakeable)</w:t>
+      </w:r>
+      <w:r>
+        <w:rPr>
+          <w:rFonts w:ascii="Courier New" w:cs="Courier New" w:eastAsia="Courier New" w:hAnsi="Courier New"/>
+          <w:color w:val="C62828"/>
+          <w:sz w:val="18"/>
+          <w:szCs w:val="18"/>
+        </w:rPr>
+        <w:br/>
+        <w:t xml:space="preserve">import { map } from 'lodash-es';</w:t>
+      </w:r>
+      <w:r>
+        <w:rPr>
+          <w:rFonts w:ascii="Courier New" w:cs="Courier New" w:eastAsia="Courier New" w:hAnsi="Courier New"/>
+          <w:color w:val="C62828"/>
+          <w:sz w:val="18"/>
+          <w:szCs w:val="18"/>
+        </w:rPr>
+        <w:br/>
+        <w:t xml:space="preserve"/>
+      </w:r>
+      <w:r>
+        <w:rPr>
+          <w:rFonts w:ascii="Courier New" w:cs="Courier New" w:eastAsia="Courier New" w:hAnsi="Courier New"/>
+          <w:color w:val="C62828"/>
+          <w:sz w:val="18"/>
+          <w:szCs w:val="18"/>
+        </w:rPr>
+        <w:br/>
+        <w:t xml:space="preserve">// Bad (Pulls in entire library)</w:t>
+      </w:r>
+      <w:r>
+        <w:rPr>
+          <w:rFonts w:ascii="Courier New" w:cs="Courier New" w:eastAsia="Courier New" w:hAnsi="Courier New"/>
+          <w:color w:val="C62828"/>
+          <w:sz w:val="18"/>
+          <w:szCs w:val="18"/>
+        </w:rPr>
+        <w:br/>
+        <w:t xml:space="preserve">import _ from 'lodash';</w:t>
+      </w:r>
+    </w:p>
+    <w:p>
+      <w:pPr>
         <w:spacing w:after="40" w:before="40"/>
       </w:pPr>
       <w:r>
@@ -3733,6 +4297,32 @@
     </w:p>
     <w:p>
       <w:pPr>
+        <w:shd w:fill="F5F5F5" w:val="clear"/>
+        <w:spacing w:after="80" w:before="60"/>
+        <w:ind w:left="360" w:right="360"/>
+      </w:pPr>
+      <w:r>
+        <w:rPr>
+          <w:rFonts w:ascii="Courier New" w:cs="Courier New" w:eastAsia="Courier New" w:hAnsi="Courier New"/>
+          <w:color w:val="C62828"/>
+          <w:sz w:val="18"/>
+          <w:szCs w:val="18"/>
+        </w:rPr>
+        <w:t xml:space="preserve">const memoizedValue = useMemo(() =&gt; computeExpensiveValue(a, b), [a, b]);</w:t>
+      </w:r>
+      <w:r>
+        <w:rPr>
+          <w:rFonts w:ascii="Courier New" w:cs="Courier New" w:eastAsia="Courier New" w:hAnsi="Courier New"/>
+          <w:color w:val="C62828"/>
+          <w:sz w:val="18"/>
+          <w:szCs w:val="18"/>
+        </w:rPr>
+        <w:br/>
+        <w:t xml:space="preserve">const memoizedCallback = useCallback(() =&gt; doSomething(a, b), [a, b]);</w:t>
+      </w:r>
+    </w:p>
+    <w:p>
+      <w:pPr>
         <w:spacing w:after="40" w:before="40"/>
       </w:pPr>
       <w:r>
@@ -3861,6 +4451,32 @@
           <w:szCs w:val="22"/>
         </w:rPr>
         <w:t xml:space="preserve">Service Workers: Intercepting network requests to provide offline functionality and near-instant loading for repeat visits.</w:t>
+      </w:r>
+    </w:p>
+    <w:p>
+      <w:pPr>
+        <w:shd w:fill="F5F5F5" w:val="clear"/>
+        <w:spacing w:after="80" w:before="60"/>
+        <w:ind w:left="360" w:right="360"/>
+      </w:pPr>
+      <w:r>
+        <w:rPr>
+          <w:rFonts w:ascii="Courier New" w:cs="Courier New" w:eastAsia="Courier New" w:hAnsi="Courier New"/>
+          <w:color w:val="C62828"/>
+          <w:sz w:val="18"/>
+          <w:szCs w:val="18"/>
+        </w:rPr>
+        <w:t xml:space="preserve">// HTTP Cache Header</w:t>
+      </w:r>
+      <w:r>
+        <w:rPr>
+          <w:rFonts w:ascii="Courier New" w:cs="Courier New" w:eastAsia="Courier New" w:hAnsi="Courier New"/>
+          <w:color w:val="C62828"/>
+          <w:sz w:val="18"/>
+          <w:szCs w:val="18"/>
+        </w:rPr>
+        <w:br/>
+        <w:t xml:space="preserve">Cache-Control: public, max-age=31536000, immutable</w:t>
       </w:r>
     </w:p>
     <w:p>
@@ -4606,6 +5222,62 @@
     </w:p>
     <w:p>
       <w:pPr>
+        <w:shd w:fill="F5F5F5" w:val="clear"/>
+        <w:spacing w:after="80" w:before="60"/>
+        <w:ind w:left="360" w:right="360"/>
+      </w:pPr>
+      <w:r>
+        <w:rPr>
+          <w:rFonts w:ascii="Courier New" w:cs="Courier New" w:eastAsia="Courier New" w:hAnsi="Courier New"/>
+          <w:color w:val="C62828"/>
+          <w:sz w:val="18"/>
+          <w:szCs w:val="18"/>
+        </w:rPr>
+        <w:t xml:space="preserve">new PerformanceObserver((entryList) =&gt; {</w:t>
+      </w:r>
+      <w:r>
+        <w:rPr>
+          <w:rFonts w:ascii="Courier New" w:cs="Courier New" w:eastAsia="Courier New" w:hAnsi="Courier New"/>
+          <w:color w:val="C62828"/>
+          <w:sz w:val="18"/>
+          <w:szCs w:val="18"/>
+        </w:rPr>
+        <w:br/>
+        <w:t xml:space="preserve">  for (const entry of entryList.getEntries()) {</w:t>
+      </w:r>
+      <w:r>
+        <w:rPr>
+          <w:rFonts w:ascii="Courier New" w:cs="Courier New" w:eastAsia="Courier New" w:hAnsi="Courier New"/>
+          <w:color w:val="C62828"/>
+          <w:sz w:val="18"/>
+          <w:szCs w:val="18"/>
+        </w:rPr>
+        <w:br/>
+        <w:t xml:space="preserve">    console.log('LCP:', entry.startTime);</w:t>
+      </w:r>
+      <w:r>
+        <w:rPr>
+          <w:rFonts w:ascii="Courier New" w:cs="Courier New" w:eastAsia="Courier New" w:hAnsi="Courier New"/>
+          <w:color w:val="C62828"/>
+          <w:sz w:val="18"/>
+          <w:szCs w:val="18"/>
+        </w:rPr>
+        <w:br/>
+        <w:t xml:space="preserve">  }</w:t>
+      </w:r>
+      <w:r>
+        <w:rPr>
+          <w:rFonts w:ascii="Courier New" w:cs="Courier New" w:eastAsia="Courier New" w:hAnsi="Courier New"/>
+          <w:color w:val="C62828"/>
+          <w:sz w:val="18"/>
+          <w:szCs w:val="18"/>
+        </w:rPr>
+        <w:br/>
+        <w:t xml:space="preserve">}).observe({ type: 'largest-contentful-paint', buffered: true });</w:t>
+      </w:r>
+    </w:p>
+    <w:p>
+      <w:pPr>
         <w:spacing w:after="40" w:before="40"/>
       </w:pPr>
       <w:r>
@@ -4738,6 +5410,52 @@
     </w:p>
     <w:p>
       <w:pPr>
+        <w:shd w:fill="F5F5F5" w:val="clear"/>
+        <w:spacing w:after="80" w:before="60"/>
+        <w:ind w:left="360" w:right="360"/>
+      </w:pPr>
+      <w:r>
+        <w:rPr>
+          <w:rFonts w:ascii="Courier New" w:cs="Courier New" w:eastAsia="Courier New" w:hAnsi="Courier New"/>
+          <w:color w:val="C62828"/>
+          <w:sz w:val="18"/>
+          <w:szCs w:val="18"/>
+        </w:rPr>
+        <w:t xml:space="preserve">// .browserslistrc</w:t>
+      </w:r>
+      <w:r>
+        <w:rPr>
+          <w:rFonts w:ascii="Courier New" w:cs="Courier New" w:eastAsia="Courier New" w:hAnsi="Courier New"/>
+          <w:color w:val="C62828"/>
+          <w:sz w:val="18"/>
+          <w:szCs w:val="18"/>
+        </w:rPr>
+        <w:br/>
+        <w:t xml:space="preserve">last 2 versions</w:t>
+      </w:r>
+      <w:r>
+        <w:rPr>
+          <w:rFonts w:ascii="Courier New" w:cs="Courier New" w:eastAsia="Courier New" w:hAnsi="Courier New"/>
+          <w:color w:val="C62828"/>
+          <w:sz w:val="18"/>
+          <w:szCs w:val="18"/>
+        </w:rPr>
+        <w:br/>
+        <w:t xml:space="preserve">&gt; 0.5%</w:t>
+      </w:r>
+      <w:r>
+        <w:rPr>
+          <w:rFonts w:ascii="Courier New" w:cs="Courier New" w:eastAsia="Courier New" w:hAnsi="Courier New"/>
+          <w:color w:val="C62828"/>
+          <w:sz w:val="18"/>
+          <w:szCs w:val="18"/>
+        </w:rPr>
+        <w:br/>
+        <w:t xml:space="preserve">not dead</w:t>
+      </w:r>
+    </w:p>
+    <w:p>
+      <w:pPr>
         <w:spacing w:after="40" w:before="40"/>
       </w:pPr>
       <w:r>
@@ -4849,6 +5567,82 @@
     </w:p>
     <w:p>
       <w:pPr>
+        <w:shd w:fill="F5F5F5" w:val="clear"/>
+        <w:spacing w:after="80" w:before="60"/>
+        <w:ind w:left="360" w:right="360"/>
+      </w:pPr>
+      <w:r>
+        <w:rPr>
+          <w:rFonts w:ascii="Courier New" w:cs="Courier New" w:eastAsia="Courier New" w:hAnsi="Courier New"/>
+          <w:color w:val="C62828"/>
+          <w:sz w:val="18"/>
+          <w:szCs w:val="18"/>
+        </w:rPr>
+        <w:t xml:space="preserve">// Optimistic update logic</w:t>
+      </w:r>
+      <w:r>
+        <w:rPr>
+          <w:rFonts w:ascii="Courier New" w:cs="Courier New" w:eastAsia="Courier New" w:hAnsi="Courier New"/>
+          <w:color w:val="C62828"/>
+          <w:sz w:val="18"/>
+          <w:szCs w:val="18"/>
+        </w:rPr>
+        <w:br/>
+        <w:t xml:space="preserve">const onLike = (id) =&gt; {</w:t>
+      </w:r>
+      <w:r>
+        <w:rPr>
+          <w:rFonts w:ascii="Courier New" w:cs="Courier New" w:eastAsia="Courier New" w:hAnsi="Courier New"/>
+          <w:color w:val="C62828"/>
+          <w:sz w:val="18"/>
+          <w:szCs w:val="18"/>
+        </w:rPr>
+        <w:br/>
+        <w:t xml:space="preserve">  setLikes(prev =&gt; ({ ...prev, [id]: true })); // Immediate UI update</w:t>
+      </w:r>
+      <w:r>
+        <w:rPr>
+          <w:rFonts w:ascii="Courier New" w:cs="Courier New" w:eastAsia="Courier New" w:hAnsi="Courier New"/>
+          <w:color w:val="C62828"/>
+          <w:sz w:val="18"/>
+          <w:szCs w:val="18"/>
+        </w:rPr>
+        <w:br/>
+        <w:t xml:space="preserve">  api.like(id).catch(() =&gt; {</w:t>
+      </w:r>
+      <w:r>
+        <w:rPr>
+          <w:rFonts w:ascii="Courier New" w:cs="Courier New" w:eastAsia="Courier New" w:hAnsi="Courier New"/>
+          <w:color w:val="C62828"/>
+          <w:sz w:val="18"/>
+          <w:szCs w:val="18"/>
+        </w:rPr>
+        <w:br/>
+        <w:t xml:space="preserve">    setLikes(prev =&gt; ({ ...prev, [id]: false })); // Rollback on error</w:t>
+      </w:r>
+      <w:r>
+        <w:rPr>
+          <w:rFonts w:ascii="Courier New" w:cs="Courier New" w:eastAsia="Courier New" w:hAnsi="Courier New"/>
+          <w:color w:val="C62828"/>
+          <w:sz w:val="18"/>
+          <w:szCs w:val="18"/>
+        </w:rPr>
+        <w:br/>
+        <w:t xml:space="preserve">  });</w:t>
+      </w:r>
+      <w:r>
+        <w:rPr>
+          <w:rFonts w:ascii="Courier New" w:cs="Courier New" w:eastAsia="Courier New" w:hAnsi="Courier New"/>
+          <w:color w:val="C62828"/>
+          <w:sz w:val="18"/>
+          <w:szCs w:val="18"/>
+        </w:rPr>
+        <w:br/>
+        <w:t xml:space="preserve">};</w:t>
+      </w:r>
+    </w:p>
+    <w:p>
+      <w:pPr>
         <w:spacing w:after="40" w:before="40"/>
       </w:pPr>
       <w:r>
@@ -4962,6 +5756,42 @@
     </w:p>
     <w:p>
       <w:pPr>
+        <w:shd w:fill="F5F5F5" w:val="clear"/>
+        <w:spacing w:after="80" w:before="60"/>
+        <w:ind w:left="360" w:right="360"/>
+      </w:pPr>
+      <w:r>
+        <w:rPr>
+          <w:rFonts w:ascii="Courier New" w:cs="Courier New" w:eastAsia="Courier New" w:hAnsi="Courier New"/>
+          <w:color w:val="C62828"/>
+          <w:sz w:val="18"/>
+          <w:szCs w:val="18"/>
+        </w:rPr>
+        <w:t xml:space="preserve">&lt;Suspense fallback={&lt;LoadingSpinner /&gt;}&gt;</w:t>
+      </w:r>
+      <w:r>
+        <w:rPr>
+          <w:rFonts w:ascii="Courier New" w:cs="Courier New" w:eastAsia="Courier New" w:hAnsi="Courier New"/>
+          <w:color w:val="C62828"/>
+          <w:sz w:val="18"/>
+          <w:szCs w:val="18"/>
+        </w:rPr>
+        <w:br/>
+        <w:t xml:space="preserve">  &lt;UserProfile /&gt;</w:t>
+      </w:r>
+      <w:r>
+        <w:rPr>
+          <w:rFonts w:ascii="Courier New" w:cs="Courier New" w:eastAsia="Courier New" w:hAnsi="Courier New"/>
+          <w:color w:val="C62828"/>
+          <w:sz w:val="18"/>
+          <w:szCs w:val="18"/>
+        </w:rPr>
+        <w:br/>
+        <w:t xml:space="preserve">&lt;/Suspense&gt;</w:t>
+      </w:r>
+    </w:p>
+    <w:p>
+      <w:pPr>
         <w:spacing w:after="40" w:before="40"/>
       </w:pPr>
       <w:r>
@@ -5094,6 +5924,62 @@
     </w:p>
     <w:p>
       <w:pPr>
+        <w:shd w:fill="F5F5F5" w:val="clear"/>
+        <w:spacing w:after="80" w:before="60"/>
+        <w:ind w:left="360" w:right="360"/>
+      </w:pPr>
+      <w:r>
+        <w:rPr>
+          <w:rFonts w:ascii="Courier New" w:cs="Courier New" w:eastAsia="Courier New" w:hAnsi="Courier New"/>
+          <w:color w:val="C62828"/>
+          <w:sz w:val="18"/>
+          <w:szCs w:val="18"/>
+        </w:rPr>
+        <w:t xml:space="preserve">&lt;picture&gt;</w:t>
+      </w:r>
+      <w:r>
+        <w:rPr>
+          <w:rFonts w:ascii="Courier New" w:cs="Courier New" w:eastAsia="Courier New" w:hAnsi="Courier New"/>
+          <w:color w:val="C62828"/>
+          <w:sz w:val="18"/>
+          <w:szCs w:val="18"/>
+        </w:rPr>
+        <w:br/>
+        <w:t xml:space="preserve">  &lt;source srcset="image.avif" type="image/avif" /&gt;</w:t>
+      </w:r>
+      <w:r>
+        <w:rPr>
+          <w:rFonts w:ascii="Courier New" w:cs="Courier New" w:eastAsia="Courier New" w:hAnsi="Courier New"/>
+          <w:color w:val="C62828"/>
+          <w:sz w:val="18"/>
+          <w:szCs w:val="18"/>
+        </w:rPr>
+        <w:br/>
+        <w:t xml:space="preserve">  &lt;source srcset="image.webp" type="image/webp" /&gt;</w:t>
+      </w:r>
+      <w:r>
+        <w:rPr>
+          <w:rFonts w:ascii="Courier New" w:cs="Courier New" w:eastAsia="Courier New" w:hAnsi="Courier New"/>
+          <w:color w:val="C62828"/>
+          <w:sz w:val="18"/>
+          <w:szCs w:val="18"/>
+        </w:rPr>
+        <w:br/>
+        <w:t xml:space="preserve">  &lt;img src="image.jpg" alt="Description" loading="lazy" /&gt;</w:t>
+      </w:r>
+      <w:r>
+        <w:rPr>
+          <w:rFonts w:ascii="Courier New" w:cs="Courier New" w:eastAsia="Courier New" w:hAnsi="Courier New"/>
+          <w:color w:val="C62828"/>
+          <w:sz w:val="18"/>
+          <w:szCs w:val="18"/>
+        </w:rPr>
+        <w:br/>
+        <w:t xml:space="preserve">&lt;/picture&gt;</w:t>
+      </w:r>
+    </w:p>
+    <w:p>
+      <w:pPr>
         <w:spacing w:after="40" w:before="40"/>
       </w:pPr>
       <w:r>
@@ -5226,6 +6112,72 @@
     </w:p>
     <w:p>
       <w:pPr>
+        <w:shd w:fill="F5F5F5" w:val="clear"/>
+        <w:spacing w:after="80" w:before="60"/>
+        <w:ind w:left="360" w:right="360"/>
+      </w:pPr>
+      <w:r>
+        <w:rPr>
+          <w:rFonts w:ascii="Courier New" w:cs="Courier New" w:eastAsia="Courier New" w:hAnsi="Courier New"/>
+          <w:color w:val="C62828"/>
+          <w:sz w:val="18"/>
+          <w:szCs w:val="18"/>
+        </w:rPr>
+        <w:t xml:space="preserve">&lt;button </w:t>
+      </w:r>
+      <w:r>
+        <w:rPr>
+          <w:rFonts w:ascii="Courier New" w:cs="Courier New" w:eastAsia="Courier New" w:hAnsi="Courier New"/>
+          <w:color w:val="C62828"/>
+          <w:sz w:val="18"/>
+          <w:szCs w:val="18"/>
+        </w:rPr>
+        <w:br/>
+        <w:t xml:space="preserve">  aria-label="Close modal" </w:t>
+      </w:r>
+      <w:r>
+        <w:rPr>
+          <w:rFonts w:ascii="Courier New" w:cs="Courier New" w:eastAsia="Courier New" w:hAnsi="Courier New"/>
+          <w:color w:val="C62828"/>
+          <w:sz w:val="18"/>
+          <w:szCs w:val="18"/>
+        </w:rPr>
+        <w:br/>
+        <w:t xml:space="preserve">  onClick={onClose}</w:t>
+      </w:r>
+      <w:r>
+        <w:rPr>
+          <w:rFonts w:ascii="Courier New" w:cs="Courier New" w:eastAsia="Courier New" w:hAnsi="Courier New"/>
+          <w:color w:val="C62828"/>
+          <w:sz w:val="18"/>
+          <w:szCs w:val="18"/>
+        </w:rPr>
+        <w:br/>
+        <w:t xml:space="preserve">&gt;</w:t>
+      </w:r>
+      <w:r>
+        <w:rPr>
+          <w:rFonts w:ascii="Courier New" w:cs="Courier New" w:eastAsia="Courier New" w:hAnsi="Courier New"/>
+          <w:color w:val="C62828"/>
+          <w:sz w:val="18"/>
+          <w:szCs w:val="18"/>
+        </w:rPr>
+        <w:br/>
+        <w:t xml:space="preserve">  &lt;Icon name="close" /&gt;</w:t>
+      </w:r>
+      <w:r>
+        <w:rPr>
+          <w:rFonts w:ascii="Courier New" w:cs="Courier New" w:eastAsia="Courier New" w:hAnsi="Courier New"/>
+          <w:color w:val="C62828"/>
+          <w:sz w:val="18"/>
+          <w:szCs w:val="18"/>
+        </w:rPr>
+        <w:br/>
+        <w:t xml:space="preserve">&lt;/button&gt;</w:t>
+      </w:r>
+    </w:p>
+    <w:p>
+      <w:pPr>
         <w:spacing w:after="40" w:before="40"/>
       </w:pPr>
       <w:r>
@@ -5358,6 +6310,82 @@
     </w:p>
     <w:p>
       <w:pPr>
+        <w:shd w:fill="F5F5F5" w:val="clear"/>
+        <w:spacing w:after="80" w:before="60"/>
+        <w:ind w:left="360" w:right="360"/>
+      </w:pPr>
+      <w:r>
+        <w:rPr>
+          <w:rFonts w:ascii="Courier New" w:cs="Courier New" w:eastAsia="Courier New" w:hAnsi="Courier New"/>
+          <w:color w:val="C62828"/>
+          <w:sz w:val="18"/>
+          <w:szCs w:val="18"/>
+        </w:rPr>
+        <w:t xml:space="preserve">// webpack.config.js snippet</w:t>
+      </w:r>
+      <w:r>
+        <w:rPr>
+          <w:rFonts w:ascii="Courier New" w:cs="Courier New" w:eastAsia="Courier New" w:hAnsi="Courier New"/>
+          <w:color w:val="C62828"/>
+          <w:sz w:val="18"/>
+          <w:szCs w:val="18"/>
+        </w:rPr>
+        <w:br/>
+        <w:t xml:space="preserve">module.exports = {</w:t>
+      </w:r>
+      <w:r>
+        <w:rPr>
+          <w:rFonts w:ascii="Courier New" w:cs="Courier New" w:eastAsia="Courier New" w:hAnsi="Courier New"/>
+          <w:color w:val="C62828"/>
+          <w:sz w:val="18"/>
+          <w:szCs w:val="18"/>
+        </w:rPr>
+        <w:br/>
+        <w:t xml:space="preserve">  entry: './src/index.js',</w:t>
+      </w:r>
+      <w:r>
+        <w:rPr>
+          <w:rFonts w:ascii="Courier New" w:cs="Courier New" w:eastAsia="Courier New" w:hAnsi="Courier New"/>
+          <w:color w:val="C62828"/>
+          <w:sz w:val="18"/>
+          <w:szCs w:val="18"/>
+        </w:rPr>
+        <w:br/>
+        <w:t xml:space="preserve">  module: {</w:t>
+      </w:r>
+      <w:r>
+        <w:rPr>
+          <w:rFonts w:ascii="Courier New" w:cs="Courier New" w:eastAsia="Courier New" w:hAnsi="Courier New"/>
+          <w:color w:val="C62828"/>
+          <w:sz w:val="18"/>
+          <w:szCs w:val="18"/>
+        </w:rPr>
+        <w:br/>
+        <w:t xml:space="preserve">    rules: [{ test: /\.js$/, use: 'babel-loader' }]</w:t>
+      </w:r>
+      <w:r>
+        <w:rPr>
+          <w:rFonts w:ascii="Courier New" w:cs="Courier New" w:eastAsia="Courier New" w:hAnsi="Courier New"/>
+          <w:color w:val="C62828"/>
+          <w:sz w:val="18"/>
+          <w:szCs w:val="18"/>
+        </w:rPr>
+        <w:br/>
+        <w:t xml:space="preserve">  }</w:t>
+      </w:r>
+      <w:r>
+        <w:rPr>
+          <w:rFonts w:ascii="Courier New" w:cs="Courier New" w:eastAsia="Courier New" w:hAnsi="Courier New"/>
+          <w:color w:val="C62828"/>
+          <w:sz w:val="18"/>
+          <w:szCs w:val="18"/>
+        </w:rPr>
+        <w:br/>
+        <w:t xml:space="preserve">};</w:t>
+      </w:r>
+    </w:p>
+    <w:p>
+      <w:pPr>
         <w:spacing w:after="40" w:before="40"/>
       </w:pPr>
       <w:r>
@@ -5620,6 +6648,52 @@
     </w:p>
     <w:p>
       <w:pPr>
+        <w:shd w:fill="F5F5F5" w:val="clear"/>
+        <w:spacing w:after="80" w:before="60"/>
+        <w:ind w:left="360" w:right="360"/>
+      </w:pPr>
+      <w:r>
+        <w:rPr>
+          <w:rFonts w:ascii="Courier New" w:cs="Courier New" w:eastAsia="Courier New" w:hAnsi="Courier New"/>
+          <w:color w:val="C62828"/>
+          <w:sz w:val="18"/>
+          <w:szCs w:val="18"/>
+        </w:rPr>
+        <w:t xml:space="preserve">test('renders welcome message', () =&gt; {</w:t>
+      </w:r>
+      <w:r>
+        <w:rPr>
+          <w:rFonts w:ascii="Courier New" w:cs="Courier New" w:eastAsia="Courier New" w:hAnsi="Courier New"/>
+          <w:color w:val="C62828"/>
+          <w:sz w:val="18"/>
+          <w:szCs w:val="18"/>
+        </w:rPr>
+        <w:br/>
+        <w:t xml:space="preserve">  render(&lt;App /&gt;);</w:t>
+      </w:r>
+      <w:r>
+        <w:rPr>
+          <w:rFonts w:ascii="Courier New" w:cs="Courier New" w:eastAsia="Courier New" w:hAnsi="Courier New"/>
+          <w:color w:val="C62828"/>
+          <w:sz w:val="18"/>
+          <w:szCs w:val="18"/>
+        </w:rPr>
+        <w:br/>
+        <w:t xml:space="preserve">  expect(screen.getByText(/welcome/i)).toBeInTheDocument();</w:t>
+      </w:r>
+      <w:r>
+        <w:rPr>
+          <w:rFonts w:ascii="Courier New" w:cs="Courier New" w:eastAsia="Courier New" w:hAnsi="Courier New"/>
+          <w:color w:val="C62828"/>
+          <w:sz w:val="18"/>
+          <w:szCs w:val="18"/>
+        </w:rPr>
+        <w:br/>
+        <w:t xml:space="preserve">});</w:t>
+      </w:r>
+    </w:p>
+    <w:p>
+      <w:pPr>
         <w:spacing w:after="40" w:before="40"/>
       </w:pPr>
       <w:r>
@@ -5733,6 +6807,52 @@
     </w:p>
     <w:p>
       <w:pPr>
+        <w:shd w:fill="F5F5F5" w:val="clear"/>
+        <w:spacing w:after="80" w:before="60"/>
+        <w:ind w:left="360" w:right="360"/>
+      </w:pPr>
+      <w:r>
+        <w:rPr>
+          <w:rFonts w:ascii="Courier New" w:cs="Courier New" w:eastAsia="Courier New" w:hAnsi="Courier New"/>
+          <w:color w:val="C62828"/>
+          <w:sz w:val="18"/>
+          <w:szCs w:val="18"/>
+        </w:rPr>
+        <w:t xml:space="preserve">// babel.config.json</w:t>
+      </w:r>
+      <w:r>
+        <w:rPr>
+          <w:rFonts w:ascii="Courier New" w:cs="Courier New" w:eastAsia="Courier New" w:hAnsi="Courier New"/>
+          <w:color w:val="C62828"/>
+          <w:sz w:val="18"/>
+          <w:szCs w:val="18"/>
+        </w:rPr>
+        <w:br/>
+        <w:t xml:space="preserve">{</w:t>
+      </w:r>
+      <w:r>
+        <w:rPr>
+          <w:rFonts w:ascii="Courier New" w:cs="Courier New" w:eastAsia="Courier New" w:hAnsi="Courier New"/>
+          <w:color w:val="C62828"/>
+          <w:sz w:val="18"/>
+          <w:szCs w:val="18"/>
+        </w:rPr>
+        <w:br/>
+        <w:t xml:space="preserve">  "presets": [["@babel/preset-env", { "useBuiltIns": "usage", "corejs": 3 }]]</w:t>
+      </w:r>
+      <w:r>
+        <w:rPr>
+          <w:rFonts w:ascii="Courier New" w:cs="Courier New" w:eastAsia="Courier New" w:hAnsi="Courier New"/>
+          <w:color w:val="C62828"/>
+          <w:sz w:val="18"/>
+          <w:szCs w:val="18"/>
+        </w:rPr>
+        <w:br/>
+        <w:t xml:space="preserve">}</w:t>
+      </w:r>
+    </w:p>
+    <w:p>
+      <w:pPr>
         <w:spacing w:after="40" w:before="40"/>
       </w:pPr>
       <w:r>
@@ -5892,6 +7012,92 @@
     </w:p>
     <w:p>
       <w:pPr>
+        <w:shd w:fill="F5F5F5" w:val="clear"/>
+        <w:spacing w:after="80" w:before="60"/>
+        <w:ind w:left="360" w:right="360"/>
+      </w:pPr>
+      <w:r>
+        <w:rPr>
+          <w:rFonts w:ascii="Courier New" w:cs="Courier New" w:eastAsia="Courier New" w:hAnsi="Courier New"/>
+          <w:color w:val="C62828"/>
+          <w:sz w:val="18"/>
+          <w:szCs w:val="18"/>
+        </w:rPr>
+        <w:t xml:space="preserve">function Welcome({ name }) {</w:t>
+      </w:r>
+      <w:r>
+        <w:rPr>
+          <w:rFonts w:ascii="Courier New" w:cs="Courier New" w:eastAsia="Courier New" w:hAnsi="Courier New"/>
+          <w:color w:val="C62828"/>
+          <w:sz w:val="18"/>
+          <w:szCs w:val="18"/>
+        </w:rPr>
+        <w:br/>
+        <w:t xml:space="preserve">  const [count, setCount] = useState(0);</w:t>
+      </w:r>
+      <w:r>
+        <w:rPr>
+          <w:rFonts w:ascii="Courier New" w:cs="Courier New" w:eastAsia="Courier New" w:hAnsi="Courier New"/>
+          <w:color w:val="C62828"/>
+          <w:sz w:val="18"/>
+          <w:szCs w:val="18"/>
+        </w:rPr>
+        <w:br/>
+        <w:t xml:space="preserve">  return (</w:t>
+      </w:r>
+      <w:r>
+        <w:rPr>
+          <w:rFonts w:ascii="Courier New" w:cs="Courier New" w:eastAsia="Courier New" w:hAnsi="Courier New"/>
+          <w:color w:val="C62828"/>
+          <w:sz w:val="18"/>
+          <w:szCs w:val="18"/>
+        </w:rPr>
+        <w:br/>
+        <w:t xml:space="preserve">    &lt;button onClick={() =&gt; setCount(count + 1)}&gt;</w:t>
+      </w:r>
+      <w:r>
+        <w:rPr>
+          <w:rFonts w:ascii="Courier New" w:cs="Courier New" w:eastAsia="Courier New" w:hAnsi="Courier New"/>
+          <w:color w:val="C62828"/>
+          <w:sz w:val="18"/>
+          <w:szCs w:val="18"/>
+        </w:rPr>
+        <w:br/>
+        <w:t xml:space="preserve">      Hello {name}, clicked {count} times</w:t>
+      </w:r>
+      <w:r>
+        <w:rPr>
+          <w:rFonts w:ascii="Courier New" w:cs="Courier New" w:eastAsia="Courier New" w:hAnsi="Courier New"/>
+          <w:color w:val="C62828"/>
+          <w:sz w:val="18"/>
+          <w:szCs w:val="18"/>
+        </w:rPr>
+        <w:br/>
+        <w:t xml:space="preserve">    &lt;/button&gt;</w:t>
+      </w:r>
+      <w:r>
+        <w:rPr>
+          <w:rFonts w:ascii="Courier New" w:cs="Courier New" w:eastAsia="Courier New" w:hAnsi="Courier New"/>
+          <w:color w:val="C62828"/>
+          <w:sz w:val="18"/>
+          <w:szCs w:val="18"/>
+        </w:rPr>
+        <w:br/>
+        <w:t xml:space="preserve">  );</w:t>
+      </w:r>
+      <w:r>
+        <w:rPr>
+          <w:rFonts w:ascii="Courier New" w:cs="Courier New" w:eastAsia="Courier New" w:hAnsi="Courier New"/>
+          <w:color w:val="C62828"/>
+          <w:sz w:val="18"/>
+          <w:szCs w:val="18"/>
+        </w:rPr>
+        <w:br/>
+        <w:t xml:space="preserve">}</w:t>
+      </w:r>
+    </w:p>
+    <w:p>
+      <w:pPr>
         <w:spacing w:after="40" w:before="40"/>
       </w:pPr>
       <w:r>
@@ -6007,6 +7213,82 @@
     </w:p>
     <w:p>
       <w:pPr>
+        <w:shd w:fill="F5F5F5" w:val="clear"/>
+        <w:spacing w:after="80" w:before="60"/>
+        <w:ind w:left="360" w:right="360"/>
+      </w:pPr>
+      <w:r>
+        <w:rPr>
+          <w:rFonts w:ascii="Courier New" w:cs="Courier New" w:eastAsia="Courier New" w:hAnsi="Courier New"/>
+          <w:color w:val="C62828"/>
+          <w:sz w:val="18"/>
+          <w:szCs w:val="18"/>
+        </w:rPr>
+        <w:t xml:space="preserve">&lt;ul&gt;</w:t>
+      </w:r>
+      <w:r>
+        <w:rPr>
+          <w:rFonts w:ascii="Courier New" w:cs="Courier New" w:eastAsia="Courier New" w:hAnsi="Courier New"/>
+          <w:color w:val="C62828"/>
+          <w:sz w:val="18"/>
+          <w:szCs w:val="18"/>
+        </w:rPr>
+        <w:br/>
+        <w:t xml:space="preserve">  {items.length &gt; 0 ? (</w:t>
+      </w:r>
+      <w:r>
+        <w:rPr>
+          <w:rFonts w:ascii="Courier New" w:cs="Courier New" w:eastAsia="Courier New" w:hAnsi="Courier New"/>
+          <w:color w:val="C62828"/>
+          <w:sz w:val="18"/>
+          <w:szCs w:val="18"/>
+        </w:rPr>
+        <w:br/>
+        <w:t xml:space="preserve">    items.map(item =&gt; &lt;li key={item.id}&gt;{item.name}&lt;/li&gt;)</w:t>
+      </w:r>
+      <w:r>
+        <w:rPr>
+          <w:rFonts w:ascii="Courier New" w:cs="Courier New" w:eastAsia="Courier New" w:hAnsi="Courier New"/>
+          <w:color w:val="C62828"/>
+          <w:sz w:val="18"/>
+          <w:szCs w:val="18"/>
+        </w:rPr>
+        <w:br/>
+        <w:t xml:space="preserve">  ) : (</w:t>
+      </w:r>
+      <w:r>
+        <w:rPr>
+          <w:rFonts w:ascii="Courier New" w:cs="Courier New" w:eastAsia="Courier New" w:hAnsi="Courier New"/>
+          <w:color w:val="C62828"/>
+          <w:sz w:val="18"/>
+          <w:szCs w:val="18"/>
+        </w:rPr>
+        <w:br/>
+        <w:t xml:space="preserve">    &lt;li&gt;No items found&lt;/li&gt;</w:t>
+      </w:r>
+      <w:r>
+        <w:rPr>
+          <w:rFonts w:ascii="Courier New" w:cs="Courier New" w:eastAsia="Courier New" w:hAnsi="Courier New"/>
+          <w:color w:val="C62828"/>
+          <w:sz w:val="18"/>
+          <w:szCs w:val="18"/>
+        </w:rPr>
+        <w:br/>
+        <w:t xml:space="preserve">  )}</w:t>
+      </w:r>
+      <w:r>
+        <w:rPr>
+          <w:rFonts w:ascii="Courier New" w:cs="Courier New" w:eastAsia="Courier New" w:hAnsi="Courier New"/>
+          <w:color w:val="C62828"/>
+          <w:sz w:val="18"/>
+          <w:szCs w:val="18"/>
+        </w:rPr>
+        <w:br/>
+        <w:t xml:space="preserve">&lt;/ul&gt;</w:t>
+      </w:r>
+    </w:p>
+    <w:p>
+      <w:pPr>
         <w:spacing w:after="40" w:before="40"/>
       </w:pPr>
       <w:r>
@@ -6771,6 +8053,72 @@
     </w:p>
     <w:p>
       <w:pPr>
+        <w:shd w:fill="F5F5F5" w:val="clear"/>
+        <w:spacing w:after="80" w:before="60"/>
+        <w:ind w:left="360" w:right="360"/>
+      </w:pPr>
+      <w:r>
+        <w:rPr>
+          <w:rFonts w:ascii="Courier New" w:cs="Courier New" w:eastAsia="Courier New" w:hAnsi="Courier New"/>
+          <w:color w:val="C62828"/>
+          <w:sz w:val="18"/>
+          <w:szCs w:val="18"/>
+        </w:rPr>
+        <w:t xml:space="preserve">const [state, dispatch] = useReducer((state, action) =&gt; {</w:t>
+      </w:r>
+      <w:r>
+        <w:rPr>
+          <w:rFonts w:ascii="Courier New" w:cs="Courier New" w:eastAsia="Courier New" w:hAnsi="Courier New"/>
+          <w:color w:val="C62828"/>
+          <w:sz w:val="18"/>
+          <w:szCs w:val="18"/>
+        </w:rPr>
+        <w:br/>
+        <w:t xml:space="preserve">  switch (action.type) {</w:t>
+      </w:r>
+      <w:r>
+        <w:rPr>
+          <w:rFonts w:ascii="Courier New" w:cs="Courier New" w:eastAsia="Courier New" w:hAnsi="Courier New"/>
+          <w:color w:val="C62828"/>
+          <w:sz w:val="18"/>
+          <w:szCs w:val="18"/>
+        </w:rPr>
+        <w:br/>
+        <w:t xml:space="preserve">    case 'increment': return { count: state.count + 1 };</w:t>
+      </w:r>
+      <w:r>
+        <w:rPr>
+          <w:rFonts w:ascii="Courier New" w:cs="Courier New" w:eastAsia="Courier New" w:hAnsi="Courier New"/>
+          <w:color w:val="C62828"/>
+          <w:sz w:val="18"/>
+          <w:szCs w:val="18"/>
+        </w:rPr>
+        <w:br/>
+        <w:t xml:space="preserve">    default: throw new Error();</w:t>
+      </w:r>
+      <w:r>
+        <w:rPr>
+          <w:rFonts w:ascii="Courier New" w:cs="Courier New" w:eastAsia="Courier New" w:hAnsi="Courier New"/>
+          <w:color w:val="C62828"/>
+          <w:sz w:val="18"/>
+          <w:szCs w:val="18"/>
+        </w:rPr>
+        <w:br/>
+        <w:t xml:space="preserve">  }</w:t>
+      </w:r>
+      <w:r>
+        <w:rPr>
+          <w:rFonts w:ascii="Courier New" w:cs="Courier New" w:eastAsia="Courier New" w:hAnsi="Courier New"/>
+          <w:color w:val="C62828"/>
+          <w:sz w:val="18"/>
+          <w:szCs w:val="18"/>
+        </w:rPr>
+        <w:br/>
+        <w:t xml:space="preserve">}, { count: 0 });</w:t>
+      </w:r>
+    </w:p>
+    <w:p>
+      <w:pPr>
         <w:spacing w:after="40" w:before="40"/>
       </w:pPr>
       <w:r>
@@ -6810,6 +8158,32 @@
     </w:p>
     <w:p>
       <w:pPr>
+        <w:shd w:fill="F5F5F5" w:val="clear"/>
+        <w:spacing w:after="80" w:before="60"/>
+        <w:ind w:left="360" w:right="360"/>
+      </w:pPr>
+      <w:r>
+        <w:rPr>
+          <w:rFonts w:ascii="Courier New" w:cs="Courier New" w:eastAsia="Courier New" w:hAnsi="Courier New"/>
+          <w:color w:val="C62828"/>
+          <w:sz w:val="18"/>
+          <w:szCs w:val="18"/>
+        </w:rPr>
+        <w:t xml:space="preserve">const inputRef = useRef(null);</w:t>
+      </w:r>
+      <w:r>
+        <w:rPr>
+          <w:rFonts w:ascii="Courier New" w:cs="Courier New" w:eastAsia="Courier New" w:hAnsi="Courier New"/>
+          <w:color w:val="C62828"/>
+          <w:sz w:val="18"/>
+          <w:szCs w:val="18"/>
+        </w:rPr>
+        <w:br/>
+        <w:t xml:space="preserve">const focusInput = () =&gt; inputRef.current.focus();</w:t>
+      </w:r>
+    </w:p>
+    <w:p>
+      <w:pPr>
         <w:spacing w:after="40" w:before="40"/>
       </w:pPr>
       <w:r>
@@ -6845,6 +8219,32 @@
           <w:szCs w:val="22"/>
         </w:rPr>
         <w:t xml:space="preserve">Consumes a context value created by React.createContext(). Avoids prop drilling for globally relevant data like themes, auth state, or locale.</w:t>
+      </w:r>
+    </w:p>
+    <w:p>
+      <w:pPr>
+        <w:shd w:fill="F5F5F5" w:val="clear"/>
+        <w:spacing w:after="80" w:before="60"/>
+        <w:ind w:left="360" w:right="360"/>
+      </w:pPr>
+      <w:r>
+        <w:rPr>
+          <w:rFonts w:ascii="Courier New" w:cs="Courier New" w:eastAsia="Courier New" w:hAnsi="Courier New"/>
+          <w:color w:val="C62828"/>
+          <w:sz w:val="18"/>
+          <w:szCs w:val="18"/>
+        </w:rPr>
+        <w:t xml:space="preserve">const ThemeContext = createContext('light');</w:t>
+      </w:r>
+      <w:r>
+        <w:rPr>
+          <w:rFonts w:ascii="Courier New" w:cs="Courier New" w:eastAsia="Courier New" w:hAnsi="Courier New"/>
+          <w:color w:val="C62828"/>
+          <w:sz w:val="18"/>
+          <w:szCs w:val="18"/>
+        </w:rPr>
+        <w:br/>
+        <w:t xml:space="preserve">const theme = useContext(ThemeContext);</w:t>
       </w:r>
     </w:p>
     <w:p>
@@ -8261,6 +9661,72 @@
           <w:szCs w:val="22"/>
         </w:rPr>
         <w:t xml:space="preserve">loader / action functions (v6.4+) — co-locate data fetching with routes (similar to Next.js getServerSideProps).</w:t>
+      </w:r>
+    </w:p>
+    <w:p>
+      <w:pPr>
+        <w:shd w:fill="F5F5F5" w:val="clear"/>
+        <w:spacing w:after="80" w:before="60"/>
+        <w:ind w:left="360" w:right="360"/>
+      </w:pPr>
+      <w:r>
+        <w:rPr>
+          <w:rFonts w:ascii="Courier New" w:cs="Courier New" w:eastAsia="Courier New" w:hAnsi="Courier New"/>
+          <w:color w:val="C62828"/>
+          <w:sz w:val="18"/>
+          <w:szCs w:val="18"/>
+        </w:rPr>
+        <w:t xml:space="preserve">&lt;BrowserRouter&gt;</w:t>
+      </w:r>
+      <w:r>
+        <w:rPr>
+          <w:rFonts w:ascii="Courier New" w:cs="Courier New" w:eastAsia="Courier New" w:hAnsi="Courier New"/>
+          <w:color w:val="C62828"/>
+          <w:sz w:val="18"/>
+          <w:szCs w:val="18"/>
+        </w:rPr>
+        <w:br/>
+        <w:t xml:space="preserve">  &lt;Routes&gt;</w:t>
+      </w:r>
+      <w:r>
+        <w:rPr>
+          <w:rFonts w:ascii="Courier New" w:cs="Courier New" w:eastAsia="Courier New" w:hAnsi="Courier New"/>
+          <w:color w:val="C62828"/>
+          <w:sz w:val="18"/>
+          <w:szCs w:val="18"/>
+        </w:rPr>
+        <w:br/>
+        <w:t xml:space="preserve">    &lt;Route path="/" element={&lt;Home /&gt;} /&gt;</w:t>
+      </w:r>
+      <w:r>
+        <w:rPr>
+          <w:rFonts w:ascii="Courier New" w:cs="Courier New" w:eastAsia="Courier New" w:hAnsi="Courier New"/>
+          <w:color w:val="C62828"/>
+          <w:sz w:val="18"/>
+          <w:szCs w:val="18"/>
+        </w:rPr>
+        <w:br/>
+        <w:t xml:space="preserve">    &lt;Route path="users/:id" element={&lt;User /&gt;} /&gt;</w:t>
+      </w:r>
+      <w:r>
+        <w:rPr>
+          <w:rFonts w:ascii="Courier New" w:cs="Courier New" w:eastAsia="Courier New" w:hAnsi="Courier New"/>
+          <w:color w:val="C62828"/>
+          <w:sz w:val="18"/>
+          <w:szCs w:val="18"/>
+        </w:rPr>
+        <w:br/>
+        <w:t xml:space="preserve">  &lt;/Routes&gt;</w:t>
+      </w:r>
+      <w:r>
+        <w:rPr>
+          <w:rFonts w:ascii="Courier New" w:cs="Courier New" w:eastAsia="Courier New" w:hAnsi="Courier New"/>
+          <w:color w:val="C62828"/>
+          <w:sz w:val="18"/>
+          <w:szCs w:val="18"/>
+        </w:rPr>
+        <w:br/>
+        <w:t xml:space="preserve">&lt;/BrowserRouter&gt;</w:t>
       </w:r>
     </w:p>
     <w:p>
@@ -10624,6 +12090,52 @@
     </w:p>
     <w:p>
       <w:pPr>
+        <w:shd w:fill="F5F5F5" w:val="clear"/>
+        <w:spacing w:after="80" w:before="60"/>
+        <w:ind w:left="360" w:right="360"/>
+      </w:pPr>
+      <w:r>
+        <w:rPr>
+          <w:rFonts w:ascii="Courier New" w:cs="Courier New" w:eastAsia="Courier New" w:hAnsi="Courier New"/>
+          <w:color w:val="C62828"/>
+          <w:sz w:val="18"/>
+          <w:szCs w:val="18"/>
+        </w:rPr>
+        <w:t xml:space="preserve">axios.interceptors.request.use(config =&gt; {</w:t>
+      </w:r>
+      <w:r>
+        <w:rPr>
+          <w:rFonts w:ascii="Courier New" w:cs="Courier New" w:eastAsia="Courier New" w:hAnsi="Courier New"/>
+          <w:color w:val="C62828"/>
+          <w:sz w:val="18"/>
+          <w:szCs w:val="18"/>
+        </w:rPr>
+        <w:br/>
+        <w:t xml:space="preserve">  config.headers.Authorization = `Bearer ${token}`;</w:t>
+      </w:r>
+      <w:r>
+        <w:rPr>
+          <w:rFonts w:ascii="Courier New" w:cs="Courier New" w:eastAsia="Courier New" w:hAnsi="Courier New"/>
+          <w:color w:val="C62828"/>
+          <w:sz w:val="18"/>
+          <w:szCs w:val="18"/>
+        </w:rPr>
+        <w:br/>
+        <w:t xml:space="preserve">  return config;</w:t>
+      </w:r>
+      <w:r>
+        <w:rPr>
+          <w:rFonts w:ascii="Courier New" w:cs="Courier New" w:eastAsia="Courier New" w:hAnsi="Courier New"/>
+          <w:color w:val="C62828"/>
+          <w:sz w:val="18"/>
+          <w:szCs w:val="18"/>
+        </w:rPr>
+        <w:br/>
+        <w:t xml:space="preserve">});</w:t>
+      </w:r>
+    </w:p>
+    <w:p>
+      <w:pPr>
         <w:pBdr>
           <w:left w:val="single" w:color="0288D1" w:sz="12" w:space="8"/>
         </w:pBdr>
@@ -10774,6 +12286,62 @@
           <w:szCs w:val="22"/>
         </w:rPr>
         <w:t xml:space="preserve">For read-heavy real-time data (feeds, notifications), Server-Sent Events (SSE) may be a simpler alternative.</w:t>
+      </w:r>
+    </w:p>
+    <w:p>
+      <w:pPr>
+        <w:shd w:fill="F5F5F5" w:val="clear"/>
+        <w:spacing w:after="80" w:before="60"/>
+        <w:ind w:left="360" w:right="360"/>
+      </w:pPr>
+      <w:r>
+        <w:rPr>
+          <w:rFonts w:ascii="Courier New" w:cs="Courier New" w:eastAsia="Courier New" w:hAnsi="Courier New"/>
+          <w:color w:val="C62828"/>
+          <w:sz w:val="18"/>
+          <w:szCs w:val="18"/>
+        </w:rPr>
+        <w:t xml:space="preserve">useEffect(() =&gt; {</w:t>
+      </w:r>
+      <w:r>
+        <w:rPr>
+          <w:rFonts w:ascii="Courier New" w:cs="Courier New" w:eastAsia="Courier New" w:hAnsi="Courier New"/>
+          <w:color w:val="C62828"/>
+          <w:sz w:val="18"/>
+          <w:szCs w:val="18"/>
+        </w:rPr>
+        <w:br/>
+        <w:t xml:space="preserve">  const ws = new WebSocket('ws://link');</w:t>
+      </w:r>
+      <w:r>
+        <w:rPr>
+          <w:rFonts w:ascii="Courier New" w:cs="Courier New" w:eastAsia="Courier New" w:hAnsi="Courier New"/>
+          <w:color w:val="C62828"/>
+          <w:sz w:val="18"/>
+          <w:szCs w:val="18"/>
+        </w:rPr>
+        <w:br/>
+        <w:t xml:space="preserve">  ws.onmessage = (e) =&gt; setData(JSON.parse(e.data));</w:t>
+      </w:r>
+      <w:r>
+        <w:rPr>
+          <w:rFonts w:ascii="Courier New" w:cs="Courier New" w:eastAsia="Courier New" w:hAnsi="Courier New"/>
+          <w:color w:val="C62828"/>
+          <w:sz w:val="18"/>
+          <w:szCs w:val="18"/>
+        </w:rPr>
+        <w:br/>
+        <w:t xml:space="preserve">  return () =&gt; ws.close();</w:t>
+      </w:r>
+      <w:r>
+        <w:rPr>
+          <w:rFonts w:ascii="Courier New" w:cs="Courier New" w:eastAsia="Courier New" w:hAnsi="Courier New"/>
+          <w:color w:val="C62828"/>
+          <w:sz w:val="18"/>
+          <w:szCs w:val="18"/>
+        </w:rPr>
+        <w:br/>
+        <w:t xml:space="preserve">}, []);</w:t>
       </w:r>
     </w:p>
     <w:p>
@@ -12624,6 +14192,60 @@
       </w:r>
     </w:p>
     <w:p>
+      <w:pPr>
+        <w:shd w:fill="F5F5F5" w:val="clear"/>
+        <w:spacing w:after="80" w:before="60"/>
+        <w:ind w:left="360" w:right="360"/>
+      </w:pPr>
+      <w:r>
+        <w:rPr>
+          <w:rFonts w:ascii="Courier New" w:cs="Courier New" w:eastAsia="Courier New" w:hAnsi="Courier New"/>
+          <w:color w:val="C62828"/>
+          <w:sz w:val="18"/>
+          <w:szCs w:val="18"/>
+        </w:rPr>
+        <w:t xml:space="preserve">export async function getServerSideProps() {</w:t>
+      </w:r>
+      <w:r>
+        <w:rPr>
+          <w:rFonts w:ascii="Courier New" w:cs="Courier New" w:eastAsia="Courier New" w:hAnsi="Courier New"/>
+          <w:color w:val="C62828"/>
+          <w:sz w:val="18"/>
+          <w:szCs w:val="18"/>
+        </w:rPr>
+        <w:br/>
+        <w:t xml:space="preserve">      const data = await fetchData();</w:t>
+      </w:r>
+      <w:r>
+        <w:rPr>
+          <w:rFonts w:ascii="Courier New" w:cs="Courier New" w:eastAsia="Courier New" w:hAnsi="Courier New"/>
+          <w:color w:val="C62828"/>
+          <w:sz w:val="18"/>
+          <w:szCs w:val="18"/>
+        </w:rPr>
+        <w:br/>
+        <w:t xml:space="preserve">      return { props: { data } };</w:t>
+      </w:r>
+      <w:r>
+        <w:rPr>
+          <w:rFonts w:ascii="Courier New" w:cs="Courier New" w:eastAsia="Courier New" w:hAnsi="Courier New"/>
+          <w:color w:val="C62828"/>
+          <w:sz w:val="18"/>
+          <w:szCs w:val="18"/>
+        </w:rPr>
+        <w:br/>
+        <w:t xml:space="preserve">      }</w:t>
+      </w:r>
+    </w:p>
+    <w:p>
+      <w:pPr>
+        <w:spacing w:after="40" w:before="40"/>
+      </w:pPr>
+      <w:r>
+        <w:t xml:space="preserve"/>
+      </w:r>
+    </w:p>
+    <w:p>
       <w:r>
         <w:br w:type="page"/>
       </w:r>
@@ -12891,6 +14513,52 @@
     </w:p>
     <w:p>
       <w:pPr>
+        <w:shd w:fill="F5F5F5" w:val="clear"/>
+        <w:spacing w:after="80" w:before="60"/>
+        <w:ind w:left="360" w:right="360"/>
+      </w:pPr>
+      <w:r>
+        <w:rPr>
+          <w:rFonts w:ascii="Courier New" w:cs="Courier New" w:eastAsia="Courier New" w:hAnsi="Courier New"/>
+          <w:color w:val="C62828"/>
+          <w:sz w:val="18"/>
+          <w:szCs w:val="18"/>
+        </w:rPr>
+        <w:t xml:space="preserve">// vite.config.js</w:t>
+      </w:r>
+      <w:r>
+        <w:rPr>
+          <w:rFonts w:ascii="Courier New" w:cs="Courier New" w:eastAsia="Courier New" w:hAnsi="Courier New"/>
+          <w:color w:val="C62828"/>
+          <w:sz w:val="18"/>
+          <w:szCs w:val="18"/>
+        </w:rPr>
+        <w:br/>
+        <w:t xml:space="preserve">export default {</w:t>
+      </w:r>
+      <w:r>
+        <w:rPr>
+          <w:rFonts w:ascii="Courier New" w:cs="Courier New" w:eastAsia="Courier New" w:hAnsi="Courier New"/>
+          <w:color w:val="C62828"/>
+          <w:sz w:val="18"/>
+          <w:szCs w:val="18"/>
+        </w:rPr>
+        <w:br/>
+        <w:t xml:space="preserve">  plugins: [react()]</w:t>
+      </w:r>
+      <w:r>
+        <w:rPr>
+          <w:rFonts w:ascii="Courier New" w:cs="Courier New" w:eastAsia="Courier New" w:hAnsi="Courier New"/>
+          <w:color w:val="C62828"/>
+          <w:sz w:val="18"/>
+          <w:szCs w:val="18"/>
+        </w:rPr>
+        <w:br/>
+        <w:t xml:space="preserve">};</w:t>
+      </w:r>
+    </w:p>
+    <w:p>
+      <w:pPr>
         <w:spacing w:after="40" w:before="40"/>
       </w:pPr>
       <w:r>
@@ -13487,6 +15155,32 @@
     </w:p>
     <w:p>
       <w:pPr>
+        <w:shd w:fill="F5F5F5" w:val="clear"/>
+        <w:spacing w:after="80" w:before="60"/>
+        <w:ind w:left="360" w:right="360"/>
+      </w:pPr>
+      <w:r>
+        <w:rPr>
+          <w:rFonts w:ascii="Courier New" w:cs="Courier New" w:eastAsia="Courier New" w:hAnsi="Courier New"/>
+          <w:color w:val="C62828"/>
+          <w:sz w:val="18"/>
+          <w:szCs w:val="18"/>
+        </w:rPr>
+        <w:t xml:space="preserve">&lt;meta property="og:title" content="Page Title" /&gt;</w:t>
+      </w:r>
+      <w:r>
+        <w:rPr>
+          <w:rFonts w:ascii="Courier New" w:cs="Courier New" w:eastAsia="Courier New" w:hAnsi="Courier New"/>
+          <w:color w:val="C62828"/>
+          <w:sz w:val="18"/>
+          <w:szCs w:val="18"/>
+        </w:rPr>
+        <w:br/>
+        <w:t xml:space="preserve">&lt;meta property="og:image" content="https://example.com/image.jpg" /&gt;</w:t>
+      </w:r>
+    </w:p>
+    <w:p>
+      <w:pPr>
         <w:spacing w:after="40" w:before="40"/>
       </w:pPr>
       <w:r>
@@ -13830,6 +15524,42 @@
     </w:p>
     <w:p>
       <w:pPr>
+        <w:shd w:fill="F5F5F5" w:val="clear"/>
+        <w:spacing w:after="80" w:before="60"/>
+        <w:ind w:left="360" w:right="360"/>
+      </w:pPr>
+      <w:r>
+        <w:rPr>
+          <w:rFonts w:ascii="Courier New" w:cs="Courier New" w:eastAsia="Courier New" w:hAnsi="Courier New"/>
+          <w:color w:val="C62828"/>
+          <w:sz w:val="18"/>
+          <w:szCs w:val="18"/>
+        </w:rPr>
+        <w:t xml:space="preserve">test('adds 1 + 2 to equal 3', () =&gt; {</w:t>
+      </w:r>
+      <w:r>
+        <w:rPr>
+          <w:rFonts w:ascii="Courier New" w:cs="Courier New" w:eastAsia="Courier New" w:hAnsi="Courier New"/>
+          <w:color w:val="C62828"/>
+          <w:sz w:val="18"/>
+          <w:szCs w:val="18"/>
+        </w:rPr>
+        <w:br/>
+        <w:t xml:space="preserve">  expect(sum(1, 2)).toBe(3);</w:t>
+      </w:r>
+      <w:r>
+        <w:rPr>
+          <w:rFonts w:ascii="Courier New" w:cs="Courier New" w:eastAsia="Courier New" w:hAnsi="Courier New"/>
+          <w:color w:val="C62828"/>
+          <w:sz w:val="18"/>
+          <w:szCs w:val="18"/>
+        </w:rPr>
+        <w:br/>
+        <w:t xml:space="preserve">});</w:t>
+      </w:r>
+    </w:p>
+    <w:p>
+      <w:pPr>
         <w:spacing w:after="40" w:before="40"/>
       </w:pPr>
       <w:r>
@@ -13945,6 +15675,42 @@
     </w:p>
     <w:p>
       <w:pPr>
+        <w:shd w:fill="F5F5F5" w:val="clear"/>
+        <w:spacing w:after="80" w:before="60"/>
+        <w:ind w:left="360" w:right="360"/>
+      </w:pPr>
+      <w:r>
+        <w:rPr>
+          <w:rFonts w:ascii="Courier New" w:cs="Courier New" w:eastAsia="Courier New" w:hAnsi="Courier New"/>
+          <w:color w:val="C62828"/>
+          <w:sz w:val="18"/>
+          <w:szCs w:val="18"/>
+        </w:rPr>
+        <w:t xml:space="preserve">render(&lt;MyButton /&gt;);</w:t>
+      </w:r>
+      <w:r>
+        <w:rPr>
+          <w:rFonts w:ascii="Courier New" w:cs="Courier New" w:eastAsia="Courier New" w:hAnsi="Courier New"/>
+          <w:color w:val="C62828"/>
+          <w:sz w:val="18"/>
+          <w:szCs w:val="18"/>
+        </w:rPr>
+        <w:br/>
+        <w:t xml:space="preserve">const btn = screen.getByRole('button', { name: /submit/i });</w:t>
+      </w:r>
+      <w:r>
+        <w:rPr>
+          <w:rFonts w:ascii="Courier New" w:cs="Courier New" w:eastAsia="Courier New" w:hAnsi="Courier New"/>
+          <w:color w:val="C62828"/>
+          <w:sz w:val="18"/>
+          <w:szCs w:val="18"/>
+        </w:rPr>
+        <w:br/>
+        <w:t xml:space="preserve">fireEvent.click(btn);</w:t>
+      </w:r>
+    </w:p>
+    <w:p>
+      <w:pPr>
         <w:spacing w:after="40" w:before="40"/>
       </w:pPr>
       <w:r>
@@ -14078,6 +15844,40 @@
       </w:r>
     </w:p>
     <w:p>
+      <w:pPr>
+        <w:shd w:fill="F5F5F5" w:val="clear"/>
+        <w:spacing w:after="80" w:before="60"/>
+        <w:ind w:left="360" w:right="360"/>
+      </w:pPr>
+      <w:r>
+        <w:rPr>
+          <w:rFonts w:ascii="Courier New" w:cs="Courier New" w:eastAsia="Courier New" w:hAnsi="Courier New"/>
+          <w:color w:val="C62828"/>
+          <w:sz w:val="18"/>
+          <w:szCs w:val="18"/>
+        </w:rPr>
+        <w:t xml:space="preserve">await page.goto('https://example.com');</w:t>
+      </w:r>
+      <w:r>
+        <w:rPr>
+          <w:rFonts w:ascii="Courier New" w:cs="Courier New" w:eastAsia="Courier New" w:hAnsi="Courier New"/>
+          <w:color w:val="C62828"/>
+          <w:sz w:val="18"/>
+          <w:szCs w:val="18"/>
+        </w:rPr>
+        <w:br/>
+        <w:t xml:space="preserve">      await page.getByRole('button', { name: 'Log in' }).click();</w:t>
+      </w:r>
+    </w:p>
+    <w:p>
+      <w:pPr>
+        <w:spacing w:after="40" w:before="40"/>
+      </w:pPr>
+      <w:r>
+        <w:t xml:space="preserve"/>
+      </w:r>
+    </w:p>
+    <w:p>
       <w:r>
         <w:br w:type="page"/>
       </w:r>
@@ -14266,6 +16066,42 @@
     </w:p>
     <w:p>
       <w:pPr>
+        <w:shd w:fill="F5F5F5" w:val="clear"/>
+        <w:spacing w:after="80" w:before="60"/>
+        <w:ind w:left="360" w:right="360"/>
+      </w:pPr>
+      <w:r>
+        <w:rPr>
+          <w:rFonts w:ascii="Courier New" w:cs="Courier New" w:eastAsia="Courier New" w:hAnsi="Courier New"/>
+          <w:color w:val="C62828"/>
+          <w:sz w:val="18"/>
+          <w:szCs w:val="18"/>
+        </w:rPr>
+        <w:t xml:space="preserve">&lt;nav aria-label="Primary"&gt;</w:t>
+      </w:r>
+      <w:r>
+        <w:rPr>
+          <w:rFonts w:ascii="Courier New" w:cs="Courier New" w:eastAsia="Courier New" w:hAnsi="Courier New"/>
+          <w:color w:val="C62828"/>
+          <w:sz w:val="18"/>
+          <w:szCs w:val="18"/>
+        </w:rPr>
+        <w:br/>
+        <w:t xml:space="preserve">  &lt;ul&gt;...&lt;/ul&gt;</w:t>
+      </w:r>
+      <w:r>
+        <w:rPr>
+          <w:rFonts w:ascii="Courier New" w:cs="Courier New" w:eastAsia="Courier New" w:hAnsi="Courier New"/>
+          <w:color w:val="C62828"/>
+          <w:sz w:val="18"/>
+          <w:szCs w:val="18"/>
+        </w:rPr>
+        <w:br/>
+        <w:t xml:space="preserve">&lt;/nav&gt;</w:t>
+      </w:r>
+    </w:p>
+    <w:p>
+      <w:pPr>
         <w:spacing w:after="40" w:before="40"/>
       </w:pPr>
       <w:r>
@@ -14476,6 +16312,82 @@
           <w:szCs w:val="22"/>
         </w:rPr>
         <w:t xml:space="preserve">For React-native map integration, react-ol (ol-react) provides component wrappers.</w:t>
+      </w:r>
+    </w:p>
+    <w:p>
+      <w:pPr>
+        <w:shd w:fill="F5F5F5" w:val="clear"/>
+        <w:spacing w:after="80" w:before="60"/>
+        <w:ind w:left="360" w:right="360"/>
+      </w:pPr>
+      <w:r>
+        <w:rPr>
+          <w:rFonts w:ascii="Courier New" w:cs="Courier New" w:eastAsia="Courier New" w:hAnsi="Courier New"/>
+          <w:color w:val="C62828"/>
+          <w:sz w:val="18"/>
+          <w:szCs w:val="18"/>
+        </w:rPr>
+        <w:t xml:space="preserve">useEffect(() =&gt; {</w:t>
+      </w:r>
+      <w:r>
+        <w:rPr>
+          <w:rFonts w:ascii="Courier New" w:cs="Courier New" w:eastAsia="Courier New" w:hAnsi="Courier New"/>
+          <w:color w:val="C62828"/>
+          <w:sz w:val="18"/>
+          <w:szCs w:val="18"/>
+        </w:rPr>
+        <w:br/>
+        <w:t xml:space="preserve">  const map = new Map({</w:t>
+      </w:r>
+      <w:r>
+        <w:rPr>
+          <w:rFonts w:ascii="Courier New" w:cs="Courier New" w:eastAsia="Courier New" w:hAnsi="Courier New"/>
+          <w:color w:val="C62828"/>
+          <w:sz w:val="18"/>
+          <w:szCs w:val="18"/>
+        </w:rPr>
+        <w:br/>
+        <w:t xml:space="preserve">    target: mapRef.current,</w:t>
+      </w:r>
+      <w:r>
+        <w:rPr>
+          <w:rFonts w:ascii="Courier New" w:cs="Courier New" w:eastAsia="Courier New" w:hAnsi="Courier New"/>
+          <w:color w:val="C62828"/>
+          <w:sz w:val="18"/>
+          <w:szCs w:val="18"/>
+        </w:rPr>
+        <w:br/>
+        <w:t xml:space="preserve">    layers: [new TileLayer({ source: new OSM() })]</w:t>
+      </w:r>
+      <w:r>
+        <w:rPr>
+          <w:rFonts w:ascii="Courier New" w:cs="Courier New" w:eastAsia="Courier New" w:hAnsi="Courier New"/>
+          <w:color w:val="C62828"/>
+          <w:sz w:val="18"/>
+          <w:szCs w:val="18"/>
+        </w:rPr>
+        <w:br/>
+        <w:t xml:space="preserve">  });</w:t>
+      </w:r>
+      <w:r>
+        <w:rPr>
+          <w:rFonts w:ascii="Courier New" w:cs="Courier New" w:eastAsia="Courier New" w:hAnsi="Courier New"/>
+          <w:color w:val="C62828"/>
+          <w:sz w:val="18"/>
+          <w:szCs w:val="18"/>
+        </w:rPr>
+        <w:br/>
+        <w:t xml:space="preserve">  return () =&gt; map.setTarget(null);</w:t>
+      </w:r>
+      <w:r>
+        <w:rPr>
+          <w:rFonts w:ascii="Courier New" w:cs="Courier New" w:eastAsia="Courier New" w:hAnsi="Courier New"/>
+          <w:color w:val="C62828"/>
+          <w:sz w:val="18"/>
+          <w:szCs w:val="18"/>
+        </w:rPr>
+        <w:br/>
+        <w:t xml:space="preserve">}, []);</w:t>
       </w:r>
     </w:p>
     <w:p>

</xml_diff>